<commit_message>
Add thesis_final_humanized_v2_embedded.md to the final bundle
</commit_message>
<xml_diff>
--- a/results/回归结果表.docx
+++ b/results/回归结果表.docx
@@ -285,7 +285,7 @@
                 <w:b w:val="0"/>
                 <w:sz w:val="21"/>
               </w:rPr>
-              <w:t>58782</w:t>
+              <w:t>53003</w:t>
             </w:r>
           </w:p>
         </w:tc>
@@ -305,7 +305,7 @@
                 <w:b w:val="0"/>
                 <w:sz w:val="21"/>
               </w:rPr>
-              <w:t>2.53e+06</w:t>
+              <w:t>2.63e+06</w:t>
             </w:r>
           </w:p>
         </w:tc>
@@ -325,7 +325,7 @@
                 <w:b w:val="0"/>
                 <w:sz w:val="21"/>
               </w:rPr>
-              <w:t>1.83e+06</w:t>
+              <w:t>1.91e+06</w:t>
             </w:r>
           </w:p>
         </w:tc>
@@ -345,7 +345,7 @@
                 <w:b w:val="0"/>
                 <w:sz w:val="21"/>
               </w:rPr>
-              <w:t>2.98e+06</w:t>
+              <w:t>3.04e+06</w:t>
             </w:r>
           </w:p>
         </w:tc>
@@ -427,7 +427,7 @@
                 <w:b w:val="0"/>
                 <w:sz w:val="21"/>
               </w:rPr>
-              <w:t>58782</w:t>
+              <w:t>53003</w:t>
             </w:r>
           </w:p>
         </w:tc>
@@ -447,7 +447,7 @@
                 <w:b w:val="0"/>
                 <w:sz w:val="21"/>
               </w:rPr>
-              <w:t>4.69e+07</w:t>
+              <w:t>4.99e+07</w:t>
             </w:r>
           </w:p>
         </w:tc>
@@ -467,7 +467,7 @@
                 <w:b w:val="0"/>
                 <w:sz w:val="21"/>
               </w:rPr>
-              <w:t>1.01e+07</w:t>
+              <w:t>1.09e+07</w:t>
             </w:r>
           </w:p>
         </w:tc>
@@ -487,7 +487,7 @@
                 <w:b w:val="0"/>
                 <w:sz w:val="21"/>
               </w:rPr>
-              <w:t>4.11e+08</w:t>
+              <w:t>4.33e+08</w:t>
             </w:r>
           </w:p>
         </w:tc>
@@ -569,7 +569,7 @@
                 <w:b w:val="0"/>
                 <w:sz w:val="21"/>
               </w:rPr>
-              <w:t>58782</w:t>
+              <w:t>53003</w:t>
             </w:r>
           </w:p>
         </w:tc>
@@ -589,7 +589,7 @@
                 <w:b w:val="0"/>
                 <w:sz w:val="21"/>
               </w:rPr>
-              <w:t>14.5024</w:t>
+              <w:t>14.6605</w:t>
             </w:r>
           </w:p>
         </w:tc>
@@ -609,7 +609,7 @@
                 <w:b w:val="0"/>
                 <w:sz w:val="21"/>
               </w:rPr>
-              <w:t>16.1245</w:t>
+              <w:t>16.2032</w:t>
             </w:r>
           </w:p>
         </w:tc>
@@ -629,7 +629,7 @@
                 <w:b w:val="0"/>
                 <w:sz w:val="21"/>
               </w:rPr>
-              <w:t>5.3284</w:t>
+              <w:t>5.2466</w:t>
             </w:r>
           </w:p>
         </w:tc>
@@ -669,7 +669,7 @@
                 <w:b w:val="0"/>
                 <w:sz w:val="21"/>
               </w:rPr>
-              <w:t>20.2372</w:t>
+              <w:t>20.3012</w:t>
             </w:r>
           </w:p>
         </w:tc>
@@ -711,7 +711,7 @@
                 <w:b w:val="0"/>
                 <w:sz w:val="21"/>
               </w:rPr>
-              <w:t>58782</w:t>
+              <w:t>53003</w:t>
             </w:r>
           </w:p>
         </w:tc>
@@ -731,7 +731,7 @@
                 <w:b w:val="0"/>
                 <w:sz w:val="21"/>
               </w:rPr>
-              <w:t>14.3762</w:t>
+              <w:t>14.4334</w:t>
             </w:r>
           </w:p>
         </w:tc>
@@ -751,7 +751,7 @@
                 <w:b w:val="0"/>
                 <w:sz w:val="21"/>
               </w:rPr>
-              <w:t>14.4217</w:t>
+              <w:t>14.4650</w:t>
             </w:r>
           </w:p>
         </w:tc>
@@ -771,7 +771,7 @@
                 <w:b w:val="0"/>
                 <w:sz w:val="21"/>
               </w:rPr>
-              <w:t>0.8667</w:t>
+              <w:t>0.8347</w:t>
             </w:r>
           </w:p>
         </w:tc>
@@ -853,7 +853,7 @@
                 <w:b w:val="0"/>
                 <w:sz w:val="21"/>
               </w:rPr>
-              <w:t>58726</w:t>
+              <w:t>52995</w:t>
             </w:r>
           </w:p>
         </w:tc>
@@ -873,7 +873,7 @@
                 <w:b w:val="0"/>
                 <w:sz w:val="21"/>
               </w:rPr>
-              <w:t>21.3368</w:t>
+              <w:t>21.4561</w:t>
             </w:r>
           </w:p>
         </w:tc>
@@ -893,7 +893,7 @@
                 <w:b w:val="0"/>
                 <w:sz w:val="21"/>
               </w:rPr>
-              <w:t>21.2090</w:t>
+              <w:t>21.3003</w:t>
             </w:r>
           </w:p>
         </w:tc>
@@ -913,7 +913,7 @@
                 <w:b w:val="0"/>
                 <w:sz w:val="21"/>
               </w:rPr>
-              <w:t>1.5022</w:t>
+              <w:t>1.4498</w:t>
             </w:r>
           </w:p>
         </w:tc>
@@ -933,7 +933,7 @@
                 <w:b w:val="0"/>
                 <w:sz w:val="21"/>
               </w:rPr>
-              <w:t>17.6023</w:t>
+              <w:t>18.3837</w:t>
             </w:r>
           </w:p>
         </w:tc>
@@ -953,7 +953,7 @@
                 <w:b w:val="0"/>
                 <w:sz w:val="21"/>
               </w:rPr>
-              <w:t>25.5606</w:t>
+              <w:t>25.6488</w:t>
             </w:r>
           </w:p>
         </w:tc>
@@ -995,7 +995,7 @@
                 <w:b w:val="0"/>
                 <w:sz w:val="21"/>
               </w:rPr>
-              <w:t>58546</w:t>
+              <w:t>52836</w:t>
             </w:r>
           </w:p>
         </w:tc>
@@ -1015,7 +1015,7 @@
                 <w:b w:val="0"/>
                 <w:sz w:val="21"/>
               </w:rPr>
-              <w:t>0.0450</w:t>
+              <w:t>0.0444</w:t>
             </w:r>
           </w:p>
         </w:tc>
@@ -1035,7 +1035,7 @@
                 <w:b w:val="0"/>
                 <w:sz w:val="21"/>
               </w:rPr>
-              <w:t>0.0309</w:t>
+              <w:t>0.0310</w:t>
             </w:r>
           </w:p>
         </w:tc>
@@ -1055,7 +1055,7 @@
                 <w:b w:val="0"/>
                 <w:sz w:val="21"/>
               </w:rPr>
-              <w:t>0.0525</w:t>
+              <w:t>0.0507</w:t>
             </w:r>
           </w:p>
         </w:tc>
@@ -1095,7 +1095,7 @@
                 <w:b w:val="0"/>
                 <w:sz w:val="21"/>
               </w:rPr>
-              <w:t>0.3318</w:t>
+              <w:t>0.3226</w:t>
             </w:r>
           </w:p>
         </w:tc>
@@ -1137,7 +1137,7 @@
                 <w:b w:val="0"/>
                 <w:sz w:val="21"/>
               </w:rPr>
-              <w:t>58493</w:t>
+              <w:t>52828</w:t>
             </w:r>
           </w:p>
         </w:tc>
@@ -1157,7 +1157,7 @@
                 <w:b w:val="0"/>
                 <w:sz w:val="21"/>
               </w:rPr>
-              <w:t>0.0000</w:t>
+              <w:t>-0.0000</w:t>
             </w:r>
           </w:p>
         </w:tc>
@@ -1177,7 +1177,7 @@
                 <w:b w:val="0"/>
                 <w:sz w:val="21"/>
               </w:rPr>
-              <w:t>-0.0122</w:t>
+              <w:t>-0.0163</w:t>
             </w:r>
           </w:p>
         </w:tc>
@@ -1197,7 +1197,7 @@
                 <w:b w:val="0"/>
                 <w:sz w:val="21"/>
               </w:rPr>
-              <w:t>0.5923</w:t>
+              <w:t>0.5814</w:t>
             </w:r>
           </w:p>
         </w:tc>
@@ -1217,7 +1217,7 @@
                 <w:b w:val="0"/>
                 <w:sz w:val="21"/>
               </w:rPr>
-              <w:t>-4.7432</w:t>
+              <w:t>-3.4021</w:t>
             </w:r>
           </w:p>
         </w:tc>
@@ -1237,7 +1237,7 @@
                 <w:b w:val="0"/>
                 <w:sz w:val="21"/>
               </w:rPr>
-              <w:t>3.6044</w:t>
+              <w:t>3.7307</w:t>
             </w:r>
           </w:p>
         </w:tc>
@@ -1259,7 +1259,7 @@
                 <w:b w:val="0"/>
                 <w:sz w:val="21"/>
               </w:rPr>
-              <w:t>管理层权力(Power, FA)</w:t>
+              <w:t>管理层权力(Power, FA口径)</w:t>
             </w:r>
           </w:p>
         </w:tc>
@@ -1279,7 +1279,7 @@
                 <w:b w:val="0"/>
                 <w:sz w:val="21"/>
               </w:rPr>
-              <w:t>50767</w:t>
+              <w:t>45679</w:t>
             </w:r>
           </w:p>
         </w:tc>
@@ -1299,7 +1299,7 @@
                 <w:b w:val="0"/>
                 <w:sz w:val="21"/>
               </w:rPr>
-              <w:t>-0.0000</w:t>
+              <w:t>0.0000</w:t>
             </w:r>
           </w:p>
         </w:tc>
@@ -1319,7 +1319,7 @@
                 <w:b w:val="0"/>
                 <w:sz w:val="21"/>
               </w:rPr>
-              <w:t>0.3150</w:t>
+              <w:t>0.2892</w:t>
             </w:r>
           </w:p>
         </w:tc>
@@ -1339,7 +1339,7 @@
                 <w:b w:val="0"/>
                 <w:sz w:val="21"/>
               </w:rPr>
-              <w:t>1.1806</w:t>
+              <w:t>1.1905</w:t>
             </w:r>
           </w:p>
         </w:tc>
@@ -1359,7 +1359,7 @@
                 <w:b w:val="0"/>
                 <w:sz w:val="21"/>
               </w:rPr>
-              <w:t>-4.7512</w:t>
+              <w:t>-4.8658</w:t>
             </w:r>
           </w:p>
         </w:tc>
@@ -1379,7 +1379,7 @@
                 <w:b w:val="0"/>
                 <w:sz w:val="21"/>
               </w:rPr>
-              <w:t>6.3753</w:t>
+              <w:t>6.3642</w:t>
             </w:r>
           </w:p>
         </w:tc>
@@ -1421,7 +1421,7 @@
                 <w:b w:val="0"/>
                 <w:sz w:val="21"/>
               </w:rPr>
-              <w:t>58782</w:t>
+              <w:t>53003</w:t>
             </w:r>
           </w:p>
         </w:tc>
@@ -1441,7 +1441,7 @@
                 <w:b w:val="0"/>
                 <w:sz w:val="21"/>
               </w:rPr>
-              <w:t>0.0287</w:t>
+              <w:t>0.0351</w:t>
             </w:r>
           </w:p>
         </w:tc>
@@ -1461,7 +1461,7 @@
                 <w:b w:val="0"/>
                 <w:sz w:val="21"/>
               </w:rPr>
-              <w:t>0.0341</w:t>
+              <w:t>0.0363</w:t>
             </w:r>
           </w:p>
         </w:tc>
@@ -1481,7 +1481,7 @@
                 <w:b w:val="0"/>
                 <w:sz w:val="21"/>
               </w:rPr>
-              <w:t>0.0759</w:t>
+              <w:t>0.0615</w:t>
             </w:r>
           </w:p>
         </w:tc>
@@ -1501,7 +1501,7 @@
                 <w:b w:val="0"/>
                 <w:sz w:val="21"/>
               </w:rPr>
-              <w:t>-0.3560</w:t>
+              <w:t>-0.2338</w:t>
             </w:r>
           </w:p>
         </w:tc>
@@ -1521,7 +1521,7 @@
                 <w:b w:val="0"/>
                 <w:sz w:val="21"/>
               </w:rPr>
-              <w:t>0.2040</w:t>
+              <w:t>0.1936</w:t>
             </w:r>
           </w:p>
         </w:tc>
@@ -1563,7 +1563,7 @@
                 <w:b w:val="0"/>
                 <w:sz w:val="21"/>
               </w:rPr>
-              <w:t>58782</w:t>
+              <w:t>53003</w:t>
             </w:r>
           </w:p>
         </w:tc>
@@ -1583,7 +1583,7 @@
                 <w:b w:val="0"/>
                 <w:sz w:val="21"/>
               </w:rPr>
-              <w:t>0.4371</w:t>
+              <w:t>0.4228</w:t>
             </w:r>
           </w:p>
         </w:tc>
@@ -1603,7 +1603,7 @@
                 <w:b w:val="0"/>
                 <w:sz w:val="21"/>
               </w:rPr>
-              <w:t>0.4264</w:t>
+              <w:t>0.4167</w:t>
             </w:r>
           </w:p>
         </w:tc>
@@ -1623,7 +1623,7 @@
                 <w:b w:val="0"/>
                 <w:sz w:val="21"/>
               </w:rPr>
-              <w:t>0.2210</w:t>
+              <w:t>0.2062</w:t>
             </w:r>
           </w:p>
         </w:tc>
@@ -1643,7 +1643,7 @@
                 <w:b w:val="0"/>
                 <w:sz w:val="21"/>
               </w:rPr>
-              <w:t>0.0516</w:t>
+              <w:t>0.0517</w:t>
             </w:r>
           </w:p>
         </w:tc>
@@ -1663,7 +1663,7 @@
                 <w:b w:val="0"/>
                 <w:sz w:val="21"/>
               </w:rPr>
-              <w:t>1.0632</w:t>
+              <w:t>0.8949</w:t>
             </w:r>
           </w:p>
         </w:tc>
@@ -1705,7 +1705,7 @@
                 <w:b w:val="0"/>
                 <w:sz w:val="21"/>
               </w:rPr>
-              <w:t>58782</w:t>
+              <w:t>53003</w:t>
             </w:r>
           </w:p>
         </w:tc>
@@ -1725,7 +1725,7 @@
                 <w:b w:val="0"/>
                 <w:sz w:val="21"/>
               </w:rPr>
-              <w:t>33.9352</w:t>
+              <w:t>34.5377</w:t>
             </w:r>
           </w:p>
         </w:tc>
@@ -1745,7 +1745,7 @@
                 <w:b w:val="0"/>
                 <w:sz w:val="21"/>
               </w:rPr>
-              <w:t>31.4600</w:t>
+              <w:t>32.2700</w:t>
             </w:r>
           </w:p>
         </w:tc>
@@ -1765,7 +1765,7 @@
                 <w:b w:val="0"/>
                 <w:sz w:val="21"/>
               </w:rPr>
-              <w:t>14.9808</w:t>
+              <w:t>15.0246</w:t>
             </w:r>
           </w:p>
         </w:tc>
@@ -1785,7 +1785,7 @@
                 <w:b w:val="0"/>
                 <w:sz w:val="21"/>
               </w:rPr>
-              <w:t>8.3300</w:t>
+              <w:t>8.4804</w:t>
             </w:r>
           </w:p>
         </w:tc>
@@ -1805,7 +1805,7 @@
                 <w:b w:val="0"/>
                 <w:sz w:val="21"/>
               </w:rPr>
-              <w:t>73.8357</w:t>
+              <w:t>74.3000</w:t>
             </w:r>
           </w:p>
         </w:tc>
@@ -1853,7 +1853,7 @@
                 <w:b w:val="0"/>
                 <w:sz w:val="21"/>
               </w:rPr>
-              <w:t>58782</w:t>
+              <w:t>53003</w:t>
             </w:r>
           </w:p>
         </w:tc>
@@ -1876,7 +1876,7 @@
                 <w:b w:val="0"/>
                 <w:sz w:val="21"/>
               </w:rPr>
-              <w:t>0.3809</w:t>
+              <w:t>0.3727</w:t>
             </w:r>
           </w:p>
         </w:tc>
@@ -1922,7 +1922,7 @@
                 <w:b w:val="0"/>
                 <w:sz w:val="21"/>
               </w:rPr>
-              <w:t>0.4856</w:t>
+              <w:t>0.4835</w:t>
             </w:r>
           </w:p>
         </w:tc>
@@ -2163,7 +2163,7 @@
                 <w:b w:val="0"/>
                 <w:sz w:val="21"/>
               </w:rPr>
-              <w:t>0.2042***</w:t>
+              <w:t>0.1968***</w:t>
             </w:r>
           </w:p>
         </w:tc>
@@ -2183,7 +2183,7 @@
                 <w:b w:val="0"/>
                 <w:sz w:val="21"/>
               </w:rPr>
-              <w:t>(116.7966)</w:t>
+              <w:t>(106.2960)</w:t>
             </w:r>
           </w:p>
         </w:tc>
@@ -2245,7 +2245,7 @@
                 <w:b w:val="0"/>
                 <w:sz w:val="21"/>
               </w:rPr>
-              <w:t>1.3993***</w:t>
+              <w:t>1.9231***</w:t>
             </w:r>
           </w:p>
         </w:tc>
@@ -2265,7 +2265,7 @@
                 <w:b w:val="0"/>
                 <w:sz w:val="21"/>
               </w:rPr>
-              <w:t>(41.7175)</w:t>
+              <w:t>(45.4085)</w:t>
             </w:r>
           </w:p>
         </w:tc>
@@ -2327,7 +2327,7 @@
                 <w:b w:val="0"/>
                 <w:sz w:val="21"/>
               </w:rPr>
-              <w:t>-0.4628***</w:t>
+              <w:t>-0.3140***</w:t>
             </w:r>
           </w:p>
         </w:tc>
@@ -2347,7 +2347,7 @@
                 <w:b w:val="0"/>
                 <w:sz w:val="21"/>
               </w:rPr>
-              <w:t>(-9.3035)</w:t>
+              <w:t>(-5.8613)</w:t>
             </w:r>
           </w:p>
         </w:tc>
@@ -2409,7 +2409,7 @@
                 <w:b w:val="0"/>
                 <w:sz w:val="21"/>
               </w:rPr>
-              <w:t>-0.2430***</w:t>
+              <w:t>-0.2431***</w:t>
             </w:r>
           </w:p>
         </w:tc>
@@ -2429,7 +2429,7 @@
                 <w:b w:val="0"/>
                 <w:sz w:val="21"/>
               </w:rPr>
-              <w:t>(-46.9738)</w:t>
+              <w:t>(-45.2869)</w:t>
             </w:r>
           </w:p>
         </w:tc>
@@ -2653,7 +2653,7 @@
                 <w:b w:val="0"/>
                 <w:sz w:val="21"/>
               </w:rPr>
-              <w:t>58493</w:t>
+              <w:t>52828</w:t>
             </w:r>
           </w:p>
         </w:tc>
@@ -2740,7 +2740,7 @@
                 <w:b w:val="0"/>
                 <w:sz w:val="21"/>
               </w:rPr>
-              <w:t>0.5305</w:t>
+              <w:t>0.5153</w:t>
             </w:r>
           </w:p>
         </w:tc>
@@ -2967,7 +2967,7 @@
                 <w:b w:val="0"/>
                 <w:sz w:val="21"/>
               </w:rPr>
-              <w:t>0.0012</w:t>
+              <w:t>0.0005</w:t>
             </w:r>
           </w:p>
         </w:tc>
@@ -3008,7 +3008,7 @@
                 <w:b w:val="0"/>
                 <w:sz w:val="21"/>
               </w:rPr>
-              <w:t>(1.3123)</w:t>
+              <w:t>(0.5202)</w:t>
             </w:r>
           </w:p>
         </w:tc>
@@ -3050,7 +3050,7 @@
                 <w:b w:val="0"/>
                 <w:sz w:val="21"/>
               </w:rPr>
-              <w:t>-0.8798***</w:t>
+              <w:t>-0.8620***</w:t>
             </w:r>
           </w:p>
         </w:tc>
@@ -3091,7 +3091,7 @@
                 <w:b w:val="0"/>
                 <w:sz w:val="21"/>
               </w:rPr>
-              <w:t>(-16.4896)</w:t>
+              <w:t>(-12.1439)</w:t>
             </w:r>
           </w:p>
         </w:tc>
@@ -3133,7 +3133,7 @@
                 <w:b w:val="0"/>
                 <w:sz w:val="21"/>
               </w:rPr>
-              <w:t>-0.1922***</w:t>
+              <w:t>-0.1082***</w:t>
             </w:r>
           </w:p>
         </w:tc>
@@ -3174,7 +3174,7 @@
                 <w:b w:val="0"/>
                 <w:sz w:val="21"/>
               </w:rPr>
-              <w:t>(-5.1012)</w:t>
+              <w:t>(-2.6826)</w:t>
             </w:r>
           </w:p>
         </w:tc>
@@ -3216,7 +3216,7 @@
                 <w:b w:val="0"/>
                 <w:sz w:val="21"/>
               </w:rPr>
-              <w:t>-0.0020***</w:t>
+              <w:t>-0.0027***</w:t>
             </w:r>
           </w:p>
         </w:tc>
@@ -3257,7 +3257,7 @@
                 <w:b w:val="0"/>
                 <w:sz w:val="21"/>
               </w:rPr>
-              <w:t>(-2.8378)</w:t>
+              <w:t>(-3.6101)</w:t>
             </w:r>
           </w:p>
         </w:tc>
@@ -3383,7 +3383,7 @@
                 <w:b w:val="0"/>
                 <w:sz w:val="21"/>
               </w:rPr>
-              <w:t>74.18</w:t>
+              <w:t>43.94</w:t>
             </w:r>
           </w:p>
         </w:tc>
@@ -3425,7 +3425,7 @@
                 <w:b w:val="0"/>
                 <w:sz w:val="21"/>
               </w:rPr>
-              <w:t>55286</w:t>
+              <w:t>49775</w:t>
             </w:r>
           </w:p>
         </w:tc>
@@ -3473,7 +3473,7 @@
                 <w:b w:val="0"/>
                 <w:sz w:val="21"/>
               </w:rPr>
-              <w:t>0.0201</w:t>
+              <w:t>0.0150</w:t>
             </w:r>
           </w:p>
         </w:tc>
@@ -3715,7 +3715,7 @@
                 <w:b w:val="0"/>
                 <w:sz w:val="21"/>
               </w:rPr>
-              <w:t>0.1406***</w:t>
+              <w:t>0.1202***</w:t>
             </w:r>
           </w:p>
         </w:tc>
@@ -3735,7 +3735,7 @@
                 <w:b w:val="0"/>
                 <w:sz w:val="21"/>
               </w:rPr>
-              <w:t>Partial F = 33.72</w:t>
+              <w:t>Partial F = 22.64</w:t>
             </w:r>
           </w:p>
         </w:tc>
@@ -3755,7 +3755,7 @@
                 <w:b w:val="0"/>
                 <w:sz w:val="21"/>
               </w:rPr>
-              <w:t>51831</w:t>
+              <w:t>46670</w:t>
             </w:r>
           </w:p>
         </w:tc>
@@ -3826,7 +3826,7 @@
                 <w:b w:val="0"/>
                 <w:sz w:val="21"/>
               </w:rPr>
-              <w:t>-0.0162</w:t>
+              <w:t>-0.0334</w:t>
             </w:r>
           </w:p>
         </w:tc>
@@ -3849,7 +3849,7 @@
                 <w:b w:val="0"/>
                 <w:sz w:val="21"/>
               </w:rPr>
-              <w:t>t = -0.8324</w:t>
+              <w:t>t = -1.5335</w:t>
             </w:r>
           </w:p>
         </w:tc>
@@ -3872,7 +3872,7 @@
                 <w:b w:val="0"/>
                 <w:sz w:val="21"/>
               </w:rPr>
-              <w:t>51831</w:t>
+              <w:t>46670</w:t>
             </w:r>
           </w:p>
         </w:tc>
@@ -3887,7 +3887,7 @@
           <w:rFonts w:ascii="Times New Roman" w:hAnsi="Times New Roman" w:eastAsia="宋体"/>
           <w:sz w:val="18"/>
         </w:rPr>
-        <w:t>注：第一阶段报告工具变量系数；Partial R² 为 0.0026，说明工具变量具有统计相关性但解释力度有限。标准误为公司层面聚类稳健标准误。</w:t>
+        <w:t>注：第一阶段报告工具变量系数；Partial R² 为 0.0019，说明工具变量具有统计相关性但解释力度有限。标准误为公司层面聚类稳健标准误。</w:t>
       </w:r>
     </w:p>
     <w:p>
@@ -4067,7 +4067,7 @@
                 <w:b w:val="0"/>
                 <w:sz w:val="21"/>
               </w:rPr>
-              <w:t>0.0014</w:t>
+              <w:t>0.0007</w:t>
             </w:r>
           </w:p>
         </w:tc>
@@ -4149,7 +4149,7 @@
                 <w:b w:val="0"/>
                 <w:sz w:val="21"/>
               </w:rPr>
-              <w:t>0.0039***</w:t>
+              <w:t>0.0024</w:t>
             </w:r>
           </w:p>
         </w:tc>
@@ -4231,7 +4231,7 @@
                 <w:b w:val="0"/>
                 <w:sz w:val="21"/>
               </w:rPr>
-              <w:t>0.0256***</w:t>
+              <w:t>0.0227***</w:t>
             </w:r>
           </w:p>
         </w:tc>
@@ -4251,7 +4251,7 @@
                 <w:b w:val="0"/>
                 <w:sz w:val="21"/>
               </w:rPr>
-              <w:t>0.0066</w:t>
+              <w:t>0.0068</w:t>
             </w:r>
           </w:p>
         </w:tc>
@@ -4313,7 +4313,7 @@
                 <w:b w:val="0"/>
                 <w:sz w:val="21"/>
               </w:rPr>
-              <w:t>0.0013</w:t>
+              <w:t>0.0007</w:t>
             </w:r>
           </w:p>
         </w:tc>
@@ -4395,7 +4395,7 @@
                 <w:b w:val="0"/>
                 <w:sz w:val="21"/>
               </w:rPr>
-              <w:t>0.000099</w:t>
+              <w:t>0.000055</w:t>
             </w:r>
           </w:p>
         </w:tc>
@@ -4435,7 +4435,7 @@
                 <w:b w:val="0"/>
                 <w:sz w:val="21"/>
               </w:rPr>
-              <w:t>[0.000025, 0.000195]</w:t>
+              <w:t>[-0.000004, 0.000132]</w:t>
             </w:r>
           </w:p>
         </w:tc>
@@ -4477,7 +4477,7 @@
                 <w:b w:val="0"/>
                 <w:sz w:val="21"/>
               </w:rPr>
-              <w:t>0.0296</w:t>
+              <w:t>0.1580</w:t>
             </w:r>
           </w:p>
         </w:tc>
@@ -4565,7 +4565,7 @@
                 <w:b w:val="0"/>
                 <w:sz w:val="21"/>
               </w:rPr>
-              <w:t>7.25%</w:t>
+              <w:t>7.40%</w:t>
             </w:r>
           </w:p>
         </w:tc>
@@ -4934,7 +4934,7 @@
                 <w:b w:val="0"/>
                 <w:sz w:val="21"/>
               </w:rPr>
-              <w:t>0.0061***</w:t>
+              <w:t>0.0036***</w:t>
             </w:r>
           </w:p>
         </w:tc>
@@ -4954,7 +4954,7 @@
                 <w:b w:val="0"/>
                 <w:sz w:val="21"/>
               </w:rPr>
-              <w:t>0.0019*</w:t>
+              <w:t>0.0010</w:t>
             </w:r>
           </w:p>
         </w:tc>
@@ -4974,7 +4974,7 @@
                 <w:b w:val="0"/>
                 <w:sz w:val="21"/>
               </w:rPr>
-              <w:t>-0.0001</w:t>
+              <w:t>-0.0003</w:t>
             </w:r>
           </w:p>
         </w:tc>
@@ -4994,7 +4994,7 @@
                 <w:b w:val="0"/>
                 <w:sz w:val="21"/>
               </w:rPr>
-              <w:t>0.0082**</w:t>
+              <w:t>0.0094***</w:t>
             </w:r>
           </w:p>
         </w:tc>
@@ -5035,7 +5035,7 @@
                 <w:b w:val="0"/>
                 <w:sz w:val="21"/>
               </w:rPr>
-              <w:t>(6.0349)</w:t>
+              <w:t>(3.7716)</w:t>
             </w:r>
           </w:p>
         </w:tc>
@@ -5055,7 +5055,7 @@
                 <w:b w:val="0"/>
                 <w:sz w:val="21"/>
               </w:rPr>
-              <w:t>(1.7945)</w:t>
+              <w:t>(0.9511)</w:t>
             </w:r>
           </w:p>
         </w:tc>
@@ -5075,7 +5075,7 @@
                 <w:b w:val="0"/>
                 <w:sz w:val="21"/>
               </w:rPr>
-              <w:t>(-0.1196)</w:t>
+              <w:t>(-0.2180)</w:t>
             </w:r>
           </w:p>
         </w:tc>
@@ -5095,7 +5095,7 @@
                 <w:b w:val="0"/>
                 <w:sz w:val="21"/>
               </w:rPr>
-              <w:t>(2.5261)</w:t>
+              <w:t>(2.8145)</w:t>
             </w:r>
           </w:p>
         </w:tc>
@@ -5443,7 +5443,7 @@
                 <w:b w:val="0"/>
                 <w:sz w:val="21"/>
               </w:rPr>
-              <w:t>55565</w:t>
+              <w:t>49940</w:t>
             </w:r>
           </w:p>
         </w:tc>
@@ -5463,7 +5463,7 @@
                 <w:b w:val="0"/>
                 <w:sz w:val="21"/>
               </w:rPr>
-              <w:t>29871</w:t>
+              <w:t>26449</w:t>
             </w:r>
           </w:p>
         </w:tc>
@@ -5483,7 +5483,7 @@
                 <w:b w:val="0"/>
                 <w:sz w:val="21"/>
               </w:rPr>
-              <w:t>35894</w:t>
+              <w:t>32515</w:t>
             </w:r>
           </w:p>
         </w:tc>
@@ -5503,7 +5503,7 @@
                 <w:b w:val="0"/>
                 <w:sz w:val="21"/>
               </w:rPr>
-              <w:t>47845</w:t>
+              <w:t>43442</w:t>
             </w:r>
           </w:p>
         </w:tc>
@@ -5551,7 +5551,7 @@
                 <w:b w:val="0"/>
                 <w:sz w:val="21"/>
               </w:rPr>
-              <w:t>0.0286</w:t>
+              <w:t>0.0430</w:t>
             </w:r>
           </w:p>
         </w:tc>
@@ -5574,7 +5574,7 @@
                 <w:b w:val="0"/>
                 <w:sz w:val="21"/>
               </w:rPr>
-              <w:t>0.0294</w:t>
+              <w:t>0.0225</w:t>
             </w:r>
           </w:p>
         </w:tc>
@@ -5597,7 +5597,7 @@
                 <w:b w:val="0"/>
                 <w:sz w:val="21"/>
               </w:rPr>
-              <w:t>0.0182</w:t>
+              <w:t>0.0131</w:t>
             </w:r>
           </w:p>
         </w:tc>
@@ -5620,7 +5620,7 @@
                 <w:b w:val="0"/>
                 <w:sz w:val="21"/>
               </w:rPr>
-              <w:t>0.0209</w:t>
+              <w:t>0.0208</w:t>
             </w:r>
           </w:p>
         </w:tc>
@@ -5849,7 +5849,7 @@
                 <w:b w:val="0"/>
                 <w:sz w:val="21"/>
               </w:rPr>
-              <w:t>0.0007</w:t>
+              <w:t>-0.0000</w:t>
             </w:r>
           </w:p>
         </w:tc>
@@ -5869,7 +5869,7 @@
                 <w:b w:val="0"/>
                 <w:sz w:val="21"/>
               </w:rPr>
-              <w:t>0.0008</w:t>
+              <w:t>-0.0002</w:t>
             </w:r>
           </w:p>
         </w:tc>
@@ -5910,7 +5910,7 @@
                 <w:b w:val="0"/>
                 <w:sz w:val="21"/>
               </w:rPr>
-              <w:t>(0.6259)</w:t>
+              <w:t>(-0.0123)</w:t>
             </w:r>
           </w:p>
         </w:tc>
@@ -5930,7 +5930,7 @@
                 <w:b w:val="0"/>
                 <w:sz w:val="21"/>
               </w:rPr>
-              <w:t>(0.4750)</w:t>
+              <w:t>(-0.1228)</w:t>
             </w:r>
           </w:p>
         </w:tc>
@@ -5972,7 +5972,7 @@
                 <w:b w:val="0"/>
                 <w:sz w:val="21"/>
               </w:rPr>
-              <w:t>-0.5222***</w:t>
+              <w:t>-0.1762</w:t>
             </w:r>
           </w:p>
         </w:tc>
@@ -5992,7 +5992,7 @@
                 <w:b w:val="0"/>
                 <w:sz w:val="21"/>
               </w:rPr>
-              <w:t>-1.0749***</w:t>
+              <w:t>-1.2419***</w:t>
             </w:r>
           </w:p>
         </w:tc>
@@ -6033,7 +6033,7 @@
                 <w:b w:val="0"/>
                 <w:sz w:val="21"/>
               </w:rPr>
-              <w:t>(-4.8164)</w:t>
+              <w:t>(-1.3496)</w:t>
             </w:r>
           </w:p>
         </w:tc>
@@ -6053,7 +6053,7 @@
                 <w:b w:val="0"/>
                 <w:sz w:val="21"/>
               </w:rPr>
-              <w:t>(-17.3292)</w:t>
+              <w:t>(-14.9064)</w:t>
             </w:r>
           </w:p>
         </w:tc>
@@ -6095,7 +6095,7 @@
                 <w:b w:val="0"/>
                 <w:sz w:val="21"/>
               </w:rPr>
-              <w:t>-0.3355***</w:t>
+              <w:t>-0.1769***</w:t>
             </w:r>
           </w:p>
         </w:tc>
@@ -6115,7 +6115,7 @@
                 <w:b w:val="0"/>
                 <w:sz w:val="21"/>
               </w:rPr>
-              <w:t>-0.1287**</w:t>
+              <w:t>-0.0767</w:t>
             </w:r>
           </w:p>
         </w:tc>
@@ -6156,7 +6156,7 @@
                 <w:b w:val="0"/>
                 <w:sz w:val="21"/>
               </w:rPr>
-              <w:t>(-5.5486)</w:t>
+              <w:t>(-2.7245)</w:t>
             </w:r>
           </w:p>
         </w:tc>
@@ -6176,7 +6176,7 @@
                 <w:b w:val="0"/>
                 <w:sz w:val="21"/>
               </w:rPr>
-              <w:t>(-2.5110)</w:t>
+              <w:t>(-1.3910)</w:t>
             </w:r>
           </w:p>
         </w:tc>
@@ -6218,7 +6218,7 @@
                 <w:b w:val="0"/>
                 <w:sz w:val="21"/>
               </w:rPr>
-              <w:t>-0.0014</w:t>
+              <w:t>-0.0022*</w:t>
             </w:r>
           </w:p>
         </w:tc>
@@ -6238,7 +6238,7 @@
                 <w:b w:val="0"/>
                 <w:sz w:val="21"/>
               </w:rPr>
-              <w:t>-0.0000</w:t>
+              <w:t>-0.0007</w:t>
             </w:r>
           </w:p>
         </w:tc>
@@ -6279,7 +6279,7 @@
                 <w:b w:val="0"/>
                 <w:sz w:val="21"/>
               </w:rPr>
-              <w:t>(-1.2957)</w:t>
+              <w:t>(-1.9395)</w:t>
             </w:r>
           </w:p>
         </w:tc>
@@ -6299,7 +6299,7 @@
                 <w:b w:val="0"/>
                 <w:sz w:val="21"/>
               </w:rPr>
-              <w:t>(-0.0459)</w:t>
+              <w:t>(-0.6982)</w:t>
             </w:r>
           </w:p>
         </w:tc>
@@ -6465,7 +6465,7 @@
                 <w:b w:val="0"/>
                 <w:sz w:val="21"/>
               </w:rPr>
-              <w:t>22091</w:t>
+              <w:t>20252</w:t>
             </w:r>
           </w:p>
         </w:tc>
@@ -6485,7 +6485,7 @@
                 <w:b w:val="0"/>
                 <w:sz w:val="21"/>
               </w:rPr>
-              <w:t>28405</w:t>
+              <w:t>25126</w:t>
             </w:r>
           </w:p>
         </w:tc>
@@ -6533,7 +6533,7 @@
                 <w:b w:val="0"/>
                 <w:sz w:val="21"/>
               </w:rPr>
-              <w:t>0.0113</w:t>
+              <w:t>0.0040</w:t>
             </w:r>
           </w:p>
         </w:tc>
@@ -6556,7 +6556,7 @@
                 <w:b w:val="0"/>
                 <w:sz w:val="21"/>
               </w:rPr>
-              <w:t>0.0342</w:t>
+              <w:t>0.0319</w:t>
             </w:r>
           </w:p>
         </w:tc>
@@ -6785,7 +6785,7 @@
                 <w:b w:val="0"/>
                 <w:sz w:val="21"/>
               </w:rPr>
-              <w:t>0.0013</w:t>
+              <w:t>-0.0005</w:t>
             </w:r>
           </w:p>
         </w:tc>
@@ -6805,7 +6805,7 @@
                 <w:b w:val="0"/>
                 <w:sz w:val="21"/>
               </w:rPr>
-              <w:t>0.0009</w:t>
+              <w:t>0.0008</w:t>
             </w:r>
           </w:p>
         </w:tc>
@@ -6846,7 +6846,7 @@
                 <w:b w:val="0"/>
                 <w:sz w:val="21"/>
               </w:rPr>
-              <w:t>(0.8141)</w:t>
+              <w:t>(-0.3123)</w:t>
             </w:r>
           </w:p>
         </w:tc>
@@ -6866,7 +6866,7 @@
                 <w:b w:val="0"/>
                 <w:sz w:val="21"/>
               </w:rPr>
-              <w:t>(0.9294)</w:t>
+              <w:t>(0.7803)</w:t>
             </w:r>
           </w:p>
         </w:tc>
@@ -6908,7 +6908,7 @@
                 <w:b w:val="0"/>
                 <w:sz w:val="21"/>
               </w:rPr>
-              <w:t>-1.1735***</w:t>
+              <w:t>-1.4192***</w:t>
             </w:r>
           </w:p>
         </w:tc>
@@ -6928,7 +6928,7 @@
                 <w:b w:val="0"/>
                 <w:sz w:val="21"/>
               </w:rPr>
-              <w:t>-0.8576***</w:t>
+              <w:t>-0.8220***</w:t>
             </w:r>
           </w:p>
         </w:tc>
@@ -6969,7 +6969,7 @@
                 <w:b w:val="0"/>
                 <w:sz w:val="21"/>
               </w:rPr>
-              <w:t>(-12.1381)</w:t>
+              <w:t>(-11.0892)</w:t>
             </w:r>
           </w:p>
         </w:tc>
@@ -6989,7 +6989,7 @@
                 <w:b w:val="0"/>
                 <w:sz w:val="21"/>
               </w:rPr>
-              <w:t>(-14.7336)</w:t>
+              <w:t>(-10.4924)</w:t>
             </w:r>
           </w:p>
         </w:tc>
@@ -7031,7 +7031,7 @@
                 <w:b w:val="0"/>
                 <w:sz w:val="21"/>
               </w:rPr>
-              <w:t>-0.2113***</w:t>
+              <w:t>-0.1303**</w:t>
             </w:r>
           </w:p>
         </w:tc>
@@ -7051,7 +7051,7 @@
                 <w:b w:val="0"/>
                 <w:sz w:val="21"/>
               </w:rPr>
-              <w:t>-0.1466***</w:t>
+              <w:t>-0.0664</w:t>
             </w:r>
           </w:p>
         </w:tc>
@@ -7092,7 +7092,7 @@
                 <w:b w:val="0"/>
                 <w:sz w:val="21"/>
               </w:rPr>
-              <w:t>(-3.0927)</w:t>
+              <w:t>(-2.0495)</w:t>
             </w:r>
           </w:p>
         </w:tc>
@@ -7112,7 +7112,7 @@
                 <w:b w:val="0"/>
                 <w:sz w:val="21"/>
               </w:rPr>
-              <w:t>(-3.5775)</w:t>
+              <w:t>(-1.4688)</w:t>
             </w:r>
           </w:p>
         </w:tc>
@@ -7154,7 +7154,7 @@
                 <w:b w:val="0"/>
                 <w:sz w:val="21"/>
               </w:rPr>
-              <w:t>-0.0025</w:t>
+              <w:t>-0.0044***</w:t>
             </w:r>
           </w:p>
         </w:tc>
@@ -7174,7 +7174,7 @@
                 <w:b w:val="0"/>
                 <w:sz w:val="21"/>
               </w:rPr>
-              <w:t>-0.0018**</w:t>
+              <w:t>-0.0024***</w:t>
             </w:r>
           </w:p>
         </w:tc>
@@ -7215,7 +7215,7 @@
                 <w:b w:val="0"/>
                 <w:sz w:val="21"/>
               </w:rPr>
-              <w:t>(-1.5435)</w:t>
+              <w:t>(-3.1814)</w:t>
             </w:r>
           </w:p>
         </w:tc>
@@ -7235,7 +7235,7 @@
                 <w:b w:val="0"/>
                 <w:sz w:val="21"/>
               </w:rPr>
-              <w:t>(-2.4108)</w:t>
+              <w:t>(-3.0589)</w:t>
             </w:r>
           </w:p>
         </w:tc>
@@ -7401,7 +7401,7 @@
                 <w:b w:val="0"/>
                 <w:sz w:val="21"/>
               </w:rPr>
-              <w:t>9125</w:t>
+              <w:t>8333</w:t>
             </w:r>
           </w:p>
         </w:tc>
@@ -7421,7 +7421,7 @@
                 <w:b w:val="0"/>
                 <w:sz w:val="21"/>
               </w:rPr>
-              <w:t>46161</w:t>
+              <w:t>41442</w:t>
             </w:r>
           </w:p>
         </w:tc>
@@ -7469,7 +7469,7 @@
                 <w:b w:val="0"/>
                 <w:sz w:val="21"/>
               </w:rPr>
-              <w:t>0.0500</w:t>
+              <w:t>0.0528</w:t>
             </w:r>
           </w:p>
         </w:tc>
@@ -7492,7 +7492,7 @@
                 <w:b w:val="0"/>
                 <w:sz w:val="21"/>
               </w:rPr>
-              <w:t>0.0181</w:t>
+              <w:t>0.0133</w:t>
             </w:r>
           </w:p>
         </w:tc>
@@ -7521,7 +7521,7 @@
           <w:b/>
           <w:sz w:val="24"/>
         </w:rPr>
-        <w:t>表9  央企与地方国企主回归结果（模型2，央地可识别比例=72.19%）</w:t>
+        <w:t>表9  央企与地方国企主回归结果（模型2，央地可识别比例=74.50%）</w:t>
       </w:r>
     </w:p>
     <w:tbl>
@@ -7721,7 +7721,7 @@
                 <w:b w:val="0"/>
                 <w:sz w:val="21"/>
               </w:rPr>
-              <w:t>-0.0011</w:t>
+              <w:t>-0.0006</w:t>
             </w:r>
           </w:p>
         </w:tc>
@@ -7741,7 +7741,7 @@
                 <w:b w:val="0"/>
                 <w:sz w:val="21"/>
               </w:rPr>
-              <w:t>-0.0008</w:t>
+              <w:t>-0.0013</w:t>
             </w:r>
           </w:p>
         </w:tc>
@@ -7782,7 +7782,7 @@
                 <w:b w:val="0"/>
                 <w:sz w:val="21"/>
               </w:rPr>
-              <w:t>(-0.5812)</w:t>
+              <w:t>(-0.3234)</w:t>
             </w:r>
           </w:p>
         </w:tc>
@@ -7802,7 +7802,7 @@
                 <w:b w:val="0"/>
                 <w:sz w:val="21"/>
               </w:rPr>
-              <w:t>(-0.5677)</w:t>
+              <w:t>(-0.9097)</w:t>
             </w:r>
           </w:p>
         </w:tc>
@@ -7844,7 +7844,7 @@
                 <w:b w:val="0"/>
                 <w:sz w:val="21"/>
               </w:rPr>
-              <w:t>-0.0373</w:t>
+              <w:t>-0.1738</w:t>
             </w:r>
           </w:p>
         </w:tc>
@@ -7864,7 +7864,7 @@
                 <w:b w:val="0"/>
                 <w:sz w:val="21"/>
               </w:rPr>
-              <w:t>-0.2433*</w:t>
+              <w:t>-0.1676</w:t>
             </w:r>
           </w:p>
         </w:tc>
@@ -7905,7 +7905,7 @@
                 <w:b w:val="0"/>
                 <w:sz w:val="21"/>
               </w:rPr>
-              <w:t>(-0.1714)</w:t>
+              <w:t>(-0.6705)</w:t>
             </w:r>
           </w:p>
         </w:tc>
@@ -7925,7 +7925,7 @@
                 <w:b w:val="0"/>
                 <w:sz w:val="21"/>
               </w:rPr>
-              <w:t>(-1.7781)</w:t>
+              <w:t>(-1.0051)</w:t>
             </w:r>
           </w:p>
         </w:tc>
@@ -7967,7 +7967,7 @@
                 <w:b w:val="0"/>
                 <w:sz w:val="21"/>
               </w:rPr>
-              <w:t>-0.1345</w:t>
+              <w:t>-0.0141</w:t>
             </w:r>
           </w:p>
         </w:tc>
@@ -7987,7 +7987,7 @@
                 <w:b w:val="0"/>
                 <w:sz w:val="21"/>
               </w:rPr>
-              <w:t>-0.2868***</w:t>
+              <w:t>-0.1513**</w:t>
             </w:r>
           </w:p>
         </w:tc>
@@ -8028,7 +8028,7 @@
                 <w:b w:val="0"/>
                 <w:sz w:val="21"/>
               </w:rPr>
-              <w:t>(-0.8293)</w:t>
+              <w:t>(-0.0929)</w:t>
             </w:r>
           </w:p>
         </w:tc>
@@ -8048,7 +8048,7 @@
                 <w:b w:val="0"/>
                 <w:sz w:val="21"/>
               </w:rPr>
-              <w:t>(-4.1069)</w:t>
+              <w:t>(-1.9918)</w:t>
             </w:r>
           </w:p>
         </w:tc>
@@ -8090,7 +8090,7 @@
                 <w:b w:val="0"/>
                 <w:sz w:val="21"/>
               </w:rPr>
-              <w:t>-0.0009</w:t>
+              <w:t>-0.0014</w:t>
             </w:r>
           </w:p>
         </w:tc>
@@ -8110,7 +8110,7 @@
                 <w:b w:val="0"/>
                 <w:sz w:val="21"/>
               </w:rPr>
-              <w:t>-0.0023</w:t>
+              <w:t>-0.0033**</w:t>
             </w:r>
           </w:p>
         </w:tc>
@@ -8151,7 +8151,7 @@
                 <w:b w:val="0"/>
                 <w:sz w:val="21"/>
               </w:rPr>
-              <w:t>(-0.4400)</w:t>
+              <w:t>(-0.7686)</w:t>
             </w:r>
           </w:p>
         </w:tc>
@@ -8171,7 +8171,7 @@
                 <w:b w:val="0"/>
                 <w:sz w:val="21"/>
               </w:rPr>
-              <w:t>(-1.5256)</w:t>
+              <w:t>(-2.1400)</w:t>
             </w:r>
           </w:p>
         </w:tc>
@@ -8337,7 +8337,7 @@
                 <w:b w:val="0"/>
                 <w:sz w:val="21"/>
               </w:rPr>
-              <w:t>4916</w:t>
+              <w:t>4647</w:t>
             </w:r>
           </w:p>
         </w:tc>
@@ -8357,7 +8357,7 @@
                 <w:b w:val="0"/>
                 <w:sz w:val="21"/>
               </w:rPr>
-              <w:t>11102</w:t>
+              <w:t>10503</w:t>
             </w:r>
           </w:p>
         </w:tc>
@@ -8405,7 +8405,7 @@
                 <w:b w:val="0"/>
                 <w:sz w:val="21"/>
               </w:rPr>
-              <w:t>0.0022</w:t>
+              <w:t>0.0012</w:t>
             </w:r>
           </w:p>
         </w:tc>
@@ -8428,7 +8428,7 @@
                 <w:b w:val="0"/>
                 <w:sz w:val="21"/>
               </w:rPr>
-              <w:t>0.0082</w:t>
+              <w:t>0.0059</w:t>
             </w:r>
           </w:p>
         </w:tc>

</xml_diff>

<commit_message>
Add chapters 5, 6, and 7 to the analysis on government subsidies and executive compensation, including machine learning methods, conclusions, policy recommendations, and references.
</commit_message>
<xml_diff>
--- a/results/回归结果表.docx
+++ b/results/回归结果表.docx
@@ -285,7 +285,7 @@
                 <w:b w:val="0"/>
                 <w:sz w:val="21"/>
               </w:rPr>
-              <w:t>53003</w:t>
+              <w:t>52980</w:t>
             </w:r>
           </w:p>
         </w:tc>
@@ -305,7 +305,7 @@
                 <w:b w:val="0"/>
                 <w:sz w:val="21"/>
               </w:rPr>
-              <w:t>2.63e+06</w:t>
+              <w:t>2.64e+06</w:t>
             </w:r>
           </w:p>
         </w:tc>
@@ -325,7 +325,7 @@
                 <w:b w:val="0"/>
                 <w:sz w:val="21"/>
               </w:rPr>
-              <w:t>1.91e+06</w:t>
+              <w:t>1.92e+06</w:t>
             </w:r>
           </w:p>
         </w:tc>
@@ -345,7 +345,7 @@
                 <w:b w:val="0"/>
                 <w:sz w:val="21"/>
               </w:rPr>
-              <w:t>3.04e+06</w:t>
+              <w:t>3.05e+06</w:t>
             </w:r>
           </w:p>
         </w:tc>
@@ -427,7 +427,7 @@
                 <w:b w:val="0"/>
                 <w:sz w:val="21"/>
               </w:rPr>
-              <w:t>53003</w:t>
+              <w:t>52980</w:t>
             </w:r>
           </w:p>
         </w:tc>
@@ -447,7 +447,7 @@
                 <w:b w:val="0"/>
                 <w:sz w:val="21"/>
               </w:rPr>
-              <w:t>4.99e+07</w:t>
+              <w:t>5.00e+07</w:t>
             </w:r>
           </w:p>
         </w:tc>
@@ -569,7 +569,7 @@
                 <w:b w:val="0"/>
                 <w:sz w:val="21"/>
               </w:rPr>
-              <w:t>53003</w:t>
+              <w:t>52980</w:t>
             </w:r>
           </w:p>
         </w:tc>
@@ -589,7 +589,7 @@
                 <w:b w:val="0"/>
                 <w:sz w:val="21"/>
               </w:rPr>
-              <w:t>14.6605</w:t>
+              <w:t>14.6590</w:t>
             </w:r>
           </w:p>
         </w:tc>
@@ -609,7 +609,7 @@
                 <w:b w:val="0"/>
                 <w:sz w:val="21"/>
               </w:rPr>
-              <w:t>16.2032</w:t>
+              <w:t>16.2039</w:t>
             </w:r>
           </w:p>
         </w:tc>
@@ -629,7 +629,7 @@
                 <w:b w:val="0"/>
                 <w:sz w:val="21"/>
               </w:rPr>
-              <w:t>5.2466</w:t>
+              <w:t>5.2503</w:t>
             </w:r>
           </w:p>
         </w:tc>
@@ -669,7 +669,7 @@
                 <w:b w:val="0"/>
                 <w:sz w:val="21"/>
               </w:rPr>
-              <w:t>20.3012</w:t>
+              <w:t>20.3015</w:t>
             </w:r>
           </w:p>
         </w:tc>
@@ -711,7 +711,7 @@
                 <w:b w:val="0"/>
                 <w:sz w:val="21"/>
               </w:rPr>
-              <w:t>53003</w:t>
+              <w:t>52980</w:t>
             </w:r>
           </w:p>
         </w:tc>
@@ -731,7 +731,7 @@
                 <w:b w:val="0"/>
                 <w:sz w:val="21"/>
               </w:rPr>
-              <w:t>14.4334</w:t>
+              <w:t>14.4341</w:t>
             </w:r>
           </w:p>
         </w:tc>
@@ -751,7 +751,7 @@
                 <w:b w:val="0"/>
                 <w:sz w:val="21"/>
               </w:rPr>
-              <w:t>14.4650</w:t>
+              <w:t>14.4653</w:t>
             </w:r>
           </w:p>
         </w:tc>
@@ -771,7 +771,7 @@
                 <w:b w:val="0"/>
                 <w:sz w:val="21"/>
               </w:rPr>
-              <w:t>0.8347</w:t>
+              <w:t>0.8354</w:t>
             </w:r>
           </w:p>
         </w:tc>
@@ -853,7 +853,7 @@
                 <w:b w:val="0"/>
                 <w:sz w:val="21"/>
               </w:rPr>
-              <w:t>52995</w:t>
+              <w:t>52972</w:t>
             </w:r>
           </w:p>
         </w:tc>
@@ -873,7 +873,7 @@
                 <w:b w:val="0"/>
                 <w:sz w:val="21"/>
               </w:rPr>
-              <w:t>21.4561</w:t>
+              <w:t>21.4579</w:t>
             </w:r>
           </w:p>
         </w:tc>
@@ -893,7 +893,7 @@
                 <w:b w:val="0"/>
                 <w:sz w:val="21"/>
               </w:rPr>
-              <w:t>21.3003</w:t>
+              <w:t>21.3015</w:t>
             </w:r>
           </w:p>
         </w:tc>
@@ -913,7 +913,7 @@
                 <w:b w:val="0"/>
                 <w:sz w:val="21"/>
               </w:rPr>
-              <w:t>1.4498</w:t>
+              <w:t>1.4521</w:t>
             </w:r>
           </w:p>
         </w:tc>
@@ -933,7 +933,7 @@
                 <w:b w:val="0"/>
                 <w:sz w:val="21"/>
               </w:rPr>
-              <w:t>18.3837</w:t>
+              <w:t>18.3829</w:t>
             </w:r>
           </w:p>
         </w:tc>
@@ -953,7 +953,7 @@
                 <w:b w:val="0"/>
                 <w:sz w:val="21"/>
               </w:rPr>
-              <w:t>25.6488</w:t>
+              <w:t>25.6603</w:t>
             </w:r>
           </w:p>
         </w:tc>
@@ -995,7 +995,7 @@
                 <w:b w:val="0"/>
                 <w:sz w:val="21"/>
               </w:rPr>
-              <w:t>52836</w:t>
+              <w:t>52813</w:t>
             </w:r>
           </w:p>
         </w:tc>
@@ -1095,7 +1095,7 @@
                 <w:b w:val="0"/>
                 <w:sz w:val="21"/>
               </w:rPr>
-              <w:t>0.3226</w:t>
+              <w:t>0.3227</w:t>
             </w:r>
           </w:p>
         </w:tc>
@@ -1137,7 +1137,7 @@
                 <w:b w:val="0"/>
                 <w:sz w:val="21"/>
               </w:rPr>
-              <w:t>52828</w:t>
+              <w:t>52805</w:t>
             </w:r>
           </w:p>
         </w:tc>
@@ -1177,7 +1177,7 @@
                 <w:b w:val="0"/>
                 <w:sz w:val="21"/>
               </w:rPr>
-              <w:t>-0.0163</w:t>
+              <w:t>-0.0147</w:t>
             </w:r>
           </w:p>
         </w:tc>
@@ -1197,7 +1197,7 @@
                 <w:b w:val="0"/>
                 <w:sz w:val="21"/>
               </w:rPr>
-              <w:t>0.5814</w:t>
+              <w:t>0.5840</w:t>
             </w:r>
           </w:p>
         </w:tc>
@@ -1217,7 +1217,7 @@
                 <w:b w:val="0"/>
                 <w:sz w:val="21"/>
               </w:rPr>
-              <w:t>-3.4021</w:t>
+              <w:t>-3.3962</w:t>
             </w:r>
           </w:p>
         </w:tc>
@@ -1237,7 +1237,7 @@
                 <w:b w:val="0"/>
                 <w:sz w:val="21"/>
               </w:rPr>
-              <w:t>3.7307</w:t>
+              <w:t>3.7591</w:t>
             </w:r>
           </w:p>
         </w:tc>
@@ -1279,7 +1279,7 @@
                 <w:b w:val="0"/>
                 <w:sz w:val="21"/>
               </w:rPr>
-              <w:t>45679</w:t>
+              <w:t>50171</w:t>
             </w:r>
           </w:p>
         </w:tc>
@@ -1299,7 +1299,7 @@
                 <w:b w:val="0"/>
                 <w:sz w:val="21"/>
               </w:rPr>
-              <w:t>0.0000</w:t>
+              <w:t>-0.0000</w:t>
             </w:r>
           </w:p>
         </w:tc>
@@ -1319,7 +1319,7 @@
                 <w:b w:val="0"/>
                 <w:sz w:val="21"/>
               </w:rPr>
-              <w:t>0.2892</w:t>
+              <w:t>0.0386</w:t>
             </w:r>
           </w:p>
         </w:tc>
@@ -1339,7 +1339,7 @@
                 <w:b w:val="0"/>
                 <w:sz w:val="21"/>
               </w:rPr>
-              <w:t>1.1905</w:t>
+              <w:t>1.0000</w:t>
             </w:r>
           </w:p>
         </w:tc>
@@ -1359,7 +1359,7 @@
                 <w:b w:val="0"/>
                 <w:sz w:val="21"/>
               </w:rPr>
-              <w:t>-4.8658</w:t>
+              <w:t>-6.3992</w:t>
             </w:r>
           </w:p>
         </w:tc>
@@ -1379,7 +1379,7 @@
                 <w:b w:val="0"/>
                 <w:sz w:val="21"/>
               </w:rPr>
-              <w:t>6.3642</w:t>
+              <w:t>4.8548</w:t>
             </w:r>
           </w:p>
         </w:tc>
@@ -1421,7 +1421,7 @@
                 <w:b w:val="0"/>
                 <w:sz w:val="21"/>
               </w:rPr>
-              <w:t>53003</w:t>
+              <w:t>52980</w:t>
             </w:r>
           </w:p>
         </w:tc>
@@ -1501,7 +1501,7 @@
                 <w:b w:val="0"/>
                 <w:sz w:val="21"/>
               </w:rPr>
-              <w:t>-0.2338</w:t>
+              <w:t>-0.2340</w:t>
             </w:r>
           </w:p>
         </w:tc>
@@ -1563,7 +1563,7 @@
                 <w:b w:val="0"/>
                 <w:sz w:val="21"/>
               </w:rPr>
-              <w:t>53003</w:t>
+              <w:t>52980</w:t>
             </w:r>
           </w:p>
         </w:tc>
@@ -1583,7 +1583,7 @@
                 <w:b w:val="0"/>
                 <w:sz w:val="21"/>
               </w:rPr>
-              <w:t>0.4228</w:t>
+              <w:t>0.4227</w:t>
             </w:r>
           </w:p>
         </w:tc>
@@ -1663,7 +1663,7 @@
                 <w:b w:val="0"/>
                 <w:sz w:val="21"/>
               </w:rPr>
-              <w:t>0.8949</w:t>
+              <w:t>0.8947</w:t>
             </w:r>
           </w:p>
         </w:tc>
@@ -1705,7 +1705,7 @@
                 <w:b w:val="0"/>
                 <w:sz w:val="21"/>
               </w:rPr>
-              <w:t>53003</w:t>
+              <w:t>52980</w:t>
             </w:r>
           </w:p>
         </w:tc>
@@ -1725,7 +1725,7 @@
                 <w:b w:val="0"/>
                 <w:sz w:val="21"/>
               </w:rPr>
-              <w:t>34.5377</w:t>
+              <w:t>34.5275</w:t>
             </w:r>
           </w:p>
         </w:tc>
@@ -1765,7 +1765,7 @@
                 <w:b w:val="0"/>
                 <w:sz w:val="21"/>
               </w:rPr>
-              <w:t>15.0246</w:t>
+              <w:t>15.0152</w:t>
             </w:r>
           </w:p>
         </w:tc>
@@ -1785,7 +1785,7 @@
                 <w:b w:val="0"/>
                 <w:sz w:val="21"/>
               </w:rPr>
-              <w:t>8.4804</w:t>
+              <w:t>8.4800</w:t>
             </w:r>
           </w:p>
         </w:tc>
@@ -1853,7 +1853,7 @@
                 <w:b w:val="0"/>
                 <w:sz w:val="21"/>
               </w:rPr>
-              <w:t>53003</w:t>
+              <w:t>52980</w:t>
             </w:r>
           </w:p>
         </w:tc>
@@ -1876,7 +1876,7 @@
                 <w:b w:val="0"/>
                 <w:sz w:val="21"/>
               </w:rPr>
-              <w:t>0.3727</w:t>
+              <w:t>0.2925</w:t>
             </w:r>
           </w:p>
         </w:tc>
@@ -1922,7 +1922,7 @@
                 <w:b w:val="0"/>
                 <w:sz w:val="21"/>
               </w:rPr>
-              <w:t>0.4835</w:t>
+              <w:t>0.4549</w:t>
             </w:r>
           </w:p>
         </w:tc>
@@ -2163,7 +2163,7 @@
                 <w:b w:val="0"/>
                 <w:sz w:val="21"/>
               </w:rPr>
-              <w:t>0.1968***</w:t>
+              <w:t>0.1979***</w:t>
             </w:r>
           </w:p>
         </w:tc>
@@ -2183,7 +2183,7 @@
                 <w:b w:val="0"/>
                 <w:sz w:val="21"/>
               </w:rPr>
-              <w:t>(106.2960)</w:t>
+              <w:t>(106.4979)</w:t>
             </w:r>
           </w:p>
         </w:tc>
@@ -2245,7 +2245,7 @@
                 <w:b w:val="0"/>
                 <w:sz w:val="21"/>
               </w:rPr>
-              <w:t>1.9231***</w:t>
+              <w:t>1.9156***</w:t>
             </w:r>
           </w:p>
         </w:tc>
@@ -2265,7 +2265,7 @@
                 <w:b w:val="0"/>
                 <w:sz w:val="21"/>
               </w:rPr>
-              <w:t>(45.4085)</w:t>
+              <w:t>(45.0073)</w:t>
             </w:r>
           </w:p>
         </w:tc>
@@ -2327,7 +2327,7 @@
                 <w:b w:val="0"/>
                 <w:sz w:val="21"/>
               </w:rPr>
-              <w:t>-0.3140***</w:t>
+              <w:t>-0.3301***</w:t>
             </w:r>
           </w:p>
         </w:tc>
@@ -2347,7 +2347,7 @@
                 <w:b w:val="0"/>
                 <w:sz w:val="21"/>
               </w:rPr>
-              <w:t>(-5.8613)</w:t>
+              <w:t>(-6.1348)</w:t>
             </w:r>
           </w:p>
         </w:tc>
@@ -2409,7 +2409,7 @@
                 <w:b w:val="0"/>
                 <w:sz w:val="21"/>
               </w:rPr>
-              <w:t>-0.2431***</w:t>
+              <w:t>-0.2268***</w:t>
             </w:r>
           </w:p>
         </w:tc>
@@ -2429,7 +2429,7 @@
                 <w:b w:val="0"/>
                 <w:sz w:val="21"/>
               </w:rPr>
-              <w:t>(-45.2869)</w:t>
+              <w:t>(-39.6966)</w:t>
             </w:r>
           </w:p>
         </w:tc>
@@ -2653,7 +2653,7 @@
                 <w:b w:val="0"/>
                 <w:sz w:val="21"/>
               </w:rPr>
-              <w:t>52828</w:t>
+              <w:t>52805</w:t>
             </w:r>
           </w:p>
         </w:tc>
@@ -2740,7 +2740,7 @@
                 <w:b w:val="0"/>
                 <w:sz w:val="21"/>
               </w:rPr>
-              <w:t>0.5153</w:t>
+              <w:t>0.5117</w:t>
             </w:r>
           </w:p>
         </w:tc>
@@ -3008,7 +3008,7 @@
                 <w:b w:val="0"/>
                 <w:sz w:val="21"/>
               </w:rPr>
-              <w:t>(0.5202)</w:t>
+              <w:t>(0.5372)</w:t>
             </w:r>
           </w:p>
         </w:tc>
@@ -3050,7 +3050,7 @@
                 <w:b w:val="0"/>
                 <w:sz w:val="21"/>
               </w:rPr>
-              <w:t>-0.8620***</w:t>
+              <w:t>-0.8576***</w:t>
             </w:r>
           </w:p>
         </w:tc>
@@ -3091,7 +3091,7 @@
                 <w:b w:val="0"/>
                 <w:sz w:val="21"/>
               </w:rPr>
-              <w:t>(-12.1439)</w:t>
+              <w:t>(-12.1195)</w:t>
             </w:r>
           </w:p>
         </w:tc>
@@ -3133,7 +3133,7 @@
                 <w:b w:val="0"/>
                 <w:sz w:val="21"/>
               </w:rPr>
-              <w:t>-0.1082***</w:t>
+              <w:t>-0.1114***</w:t>
             </w:r>
           </w:p>
         </w:tc>
@@ -3174,7 +3174,7 @@
                 <w:b w:val="0"/>
                 <w:sz w:val="21"/>
               </w:rPr>
-              <w:t>(-2.6826)</w:t>
+              <w:t>(-2.7716)</w:t>
             </w:r>
           </w:p>
         </w:tc>
@@ -3257,7 +3257,7 @@
                 <w:b w:val="0"/>
                 <w:sz w:val="21"/>
               </w:rPr>
-              <w:t>(-3.6101)</w:t>
+              <w:t>(-3.6328)</w:t>
             </w:r>
           </w:p>
         </w:tc>
@@ -3383,7 +3383,7 @@
                 <w:b w:val="0"/>
                 <w:sz w:val="21"/>
               </w:rPr>
-              <w:t>43.94</w:t>
+              <w:t>44.01</w:t>
             </w:r>
           </w:p>
         </w:tc>
@@ -3425,7 +3425,7 @@
                 <w:b w:val="0"/>
                 <w:sz w:val="21"/>
               </w:rPr>
-              <w:t>49775</w:t>
+              <w:t>49755</w:t>
             </w:r>
           </w:p>
         </w:tc>
@@ -3473,7 +3473,7 @@
                 <w:b w:val="0"/>
                 <w:sz w:val="21"/>
               </w:rPr>
-              <w:t>0.0150</w:t>
+              <w:t>0.0149</w:t>
             </w:r>
           </w:p>
         </w:tc>
@@ -3502,7 +3502,7 @@
           <w:b/>
           <w:sz w:val="24"/>
         </w:rPr>
-        <w:t>表4  工具变量（FE-2SLS）估计结果</w:t>
+        <w:t>表4  工具变量与 Heckman 两阶段结果</w:t>
       </w:r>
     </w:p>
     <w:tbl>
@@ -3549,7 +3549,7 @@
                 <w:b/>
                 <w:sz w:val="21"/>
               </w:rPr>
-              <w:t>阶段</w:t>
+              <w:t>识别方案</w:t>
             </w:r>
           </w:p>
         </w:tc>
@@ -3575,7 +3575,7 @@
                 <w:b/>
                 <w:sz w:val="21"/>
               </w:rPr>
-              <w:t>因变量</w:t>
+              <w:t>工具/排除变量</w:t>
             </w:r>
           </w:p>
         </w:tc>
@@ -3601,7 +3601,7 @@
                 <w:b/>
                 <w:sz w:val="21"/>
               </w:rPr>
-              <w:t>系数</w:t>
+              <w:t>一阶段统计量</w:t>
             </w:r>
           </w:p>
         </w:tc>
@@ -3627,7 +3627,7 @@
                 <w:b/>
                 <w:sz w:val="21"/>
               </w:rPr>
-              <w:t>统计量</w:t>
+              <w:t>二阶段补贴系数</w:t>
             </w:r>
           </w:p>
         </w:tc>
@@ -3675,7 +3675,7 @@
                 <w:b w:val="0"/>
                 <w:sz w:val="21"/>
               </w:rPr>
-              <w:t>第一阶段</w:t>
+              <w:t>基准工具变量</w:t>
             </w:r>
           </w:p>
         </w:tc>
@@ -3695,7 +3695,7 @@
                 <w:b w:val="0"/>
                 <w:sz w:val="21"/>
               </w:rPr>
-              <w:t>lnSubsidy_l1</w:t>
+              <w:t>滞后一期同城同年其他企业平均补助</w:t>
             </w:r>
           </w:p>
         </w:tc>
@@ -3715,7 +3715,7 @@
                 <w:b w:val="0"/>
                 <w:sz w:val="21"/>
               </w:rPr>
-              <w:t>0.1202***</w:t>
+              <w:t>F=22.77</w:t>
             </w:r>
           </w:p>
         </w:tc>
@@ -3735,7 +3735,7 @@
                 <w:b w:val="0"/>
                 <w:sz w:val="21"/>
               </w:rPr>
-              <w:t>Partial F = 22.64</w:t>
+              <w:t>-0.0337; t=-1.5560</w:t>
             </w:r>
           </w:p>
         </w:tc>
@@ -3755,7 +3755,211 @@
                 <w:b w:val="0"/>
                 <w:sz w:val="21"/>
               </w:rPr>
-              <w:t>46670</w:t>
+              <w:t>46634</w:t>
+            </w:r>
+          </w:p>
+        </w:tc>
+      </w:tr>
+      <w:tr>
+        <w:tc>
+          <w:tcPr>
+            <w:tcW w:type="dxa" w:w="1728"/>
+          </w:tcPr>
+          <w:p>
+            <w:pPr>
+              <w:spacing w:before="20" w:after="20" w:line="280" w:lineRule="exact"/>
+              <w:jc w:val="center"/>
+            </w:pPr>
+            <w:r/>
+            <w:r>
+              <w:rPr>
+                <w:rFonts w:ascii="Times New Roman" w:hAnsi="Times New Roman" w:eastAsia="宋体"/>
+                <w:b w:val="0"/>
+                <w:sz w:val="21"/>
+              </w:rPr>
+              <w:t>简单替代工具变量</w:t>
+            </w:r>
+          </w:p>
+        </w:tc>
+        <w:tc>
+          <w:tcPr>
+            <w:tcW w:type="dxa" w:w="1728"/>
+          </w:tcPr>
+          <w:p>
+            <w:pPr>
+              <w:spacing w:before="20" w:after="20" w:line="280" w:lineRule="exact"/>
+              <w:jc w:val="left"/>
+            </w:pPr>
+            <w:r/>
+            <w:r>
+              <w:rPr>
+                <w:rFonts w:ascii="Times New Roman" w:hAnsi="Times New Roman" w:eastAsia="宋体"/>
+                <w:b w:val="0"/>
+                <w:sz w:val="21"/>
+              </w:rPr>
+              <w:t>滞后一期同行业同年其他企业平均补助</w:t>
+            </w:r>
+          </w:p>
+        </w:tc>
+        <w:tc>
+          <w:tcPr>
+            <w:tcW w:type="dxa" w:w="1728"/>
+          </w:tcPr>
+          <w:p>
+            <w:pPr>
+              <w:spacing w:before="20" w:after="20" w:line="280" w:lineRule="exact"/>
+              <w:jc w:val="center"/>
+            </w:pPr>
+            <w:r/>
+            <w:r>
+              <w:rPr>
+                <w:rFonts w:ascii="Times New Roman" w:hAnsi="Times New Roman" w:eastAsia="宋体"/>
+                <w:b w:val="0"/>
+                <w:sz w:val="21"/>
+              </w:rPr>
+              <w:t>F=105.46</w:t>
+            </w:r>
+          </w:p>
+        </w:tc>
+        <w:tc>
+          <w:tcPr>
+            <w:tcW w:type="dxa" w:w="1728"/>
+          </w:tcPr>
+          <w:p>
+            <w:pPr>
+              <w:spacing w:before="20" w:after="20" w:line="280" w:lineRule="exact"/>
+              <w:jc w:val="center"/>
+            </w:pPr>
+            <w:r/>
+            <w:r>
+              <w:rPr>
+                <w:rFonts w:ascii="Times New Roman" w:hAnsi="Times New Roman" w:eastAsia="宋体"/>
+                <w:b w:val="0"/>
+                <w:sz w:val="21"/>
+              </w:rPr>
+              <w:t>-0.0109; t=-1.3223</w:t>
+            </w:r>
+          </w:p>
+        </w:tc>
+        <w:tc>
+          <w:tcPr>
+            <w:tcW w:type="dxa" w:w="1728"/>
+          </w:tcPr>
+          <w:p>
+            <w:pPr>
+              <w:spacing w:before="20" w:after="20" w:line="280" w:lineRule="exact"/>
+              <w:jc w:val="center"/>
+            </w:pPr>
+            <w:r/>
+            <w:r>
+              <w:rPr>
+                <w:rFonts w:ascii="Times New Roman" w:hAnsi="Times New Roman" w:eastAsia="宋体"/>
+                <w:b w:val="0"/>
+                <w:sz w:val="21"/>
+              </w:rPr>
+              <w:t>49741</w:t>
+            </w:r>
+          </w:p>
+        </w:tc>
+      </w:tr>
+      <w:tr>
+        <w:tc>
+          <w:tcPr>
+            <w:tcW w:type="dxa" w:w="1728"/>
+          </w:tcPr>
+          <w:p>
+            <w:pPr>
+              <w:spacing w:before="20" w:after="20" w:line="280" w:lineRule="exact"/>
+              <w:jc w:val="center"/>
+            </w:pPr>
+            <w:r/>
+            <w:r>
+              <w:rPr>
+                <w:rFonts w:ascii="Times New Roman" w:hAnsi="Times New Roman" w:eastAsia="宋体"/>
+                <w:b w:val="0"/>
+                <w:sz w:val="21"/>
+              </w:rPr>
+              <w:t>精炼双工具变量</w:t>
+            </w:r>
+          </w:p>
+        </w:tc>
+        <w:tc>
+          <w:tcPr>
+            <w:tcW w:type="dxa" w:w="1728"/>
+          </w:tcPr>
+          <w:p>
+            <w:pPr>
+              <w:spacing w:before="20" w:after="20" w:line="280" w:lineRule="exact"/>
+              <w:jc w:val="left"/>
+            </w:pPr>
+            <w:r/>
+            <w:r>
+              <w:rPr>
+                <w:rFonts w:ascii="Times New Roman" w:hAnsi="Times New Roman" w:eastAsia="宋体"/>
+                <w:b w:val="0"/>
+                <w:sz w:val="21"/>
+              </w:rPr>
+              <w:t>滞后一期同行业同年排除本省平均补助 + 同省同行业同年排除本市平均补助</w:t>
+            </w:r>
+          </w:p>
+        </w:tc>
+        <w:tc>
+          <w:tcPr>
+            <w:tcW w:type="dxa" w:w="1728"/>
+          </w:tcPr>
+          <w:p>
+            <w:pPr>
+              <w:spacing w:before="20" w:after="20" w:line="280" w:lineRule="exact"/>
+              <w:jc w:val="center"/>
+            </w:pPr>
+            <w:r/>
+            <w:r>
+              <w:rPr>
+                <w:rFonts w:ascii="Times New Roman" w:hAnsi="Times New Roman" w:eastAsia="宋体"/>
+                <w:b w:val="0"/>
+                <w:sz w:val="21"/>
+              </w:rPr>
+              <w:t>F=77.74; OverID p=0.040</w:t>
+            </w:r>
+          </w:p>
+        </w:tc>
+        <w:tc>
+          <w:tcPr>
+            <w:tcW w:type="dxa" w:w="1728"/>
+          </w:tcPr>
+          <w:p>
+            <w:pPr>
+              <w:spacing w:before="20" w:after="20" w:line="280" w:lineRule="exact"/>
+              <w:jc w:val="center"/>
+            </w:pPr>
+            <w:r/>
+            <w:r>
+              <w:rPr>
+                <w:rFonts w:ascii="Times New Roman" w:hAnsi="Times New Roman" w:eastAsia="宋体"/>
+                <w:b w:val="0"/>
+                <w:sz w:val="21"/>
+              </w:rPr>
+              <w:t>-0.0233**; t=-2.1588</w:t>
+            </w:r>
+          </w:p>
+        </w:tc>
+        <w:tc>
+          <w:tcPr>
+            <w:tcW w:type="dxa" w:w="1728"/>
+          </w:tcPr>
+          <w:p>
+            <w:pPr>
+              <w:spacing w:before="20" w:after="20" w:line="280" w:lineRule="exact"/>
+              <w:jc w:val="center"/>
+            </w:pPr>
+            <w:r/>
+            <w:r>
+              <w:rPr>
+                <w:rFonts w:ascii="Times New Roman" w:hAnsi="Times New Roman" w:eastAsia="宋体"/>
+                <w:b w:val="0"/>
+                <w:sz w:val="21"/>
+              </w:rPr>
+              <w:t>38620</w:t>
             </w:r>
           </w:p>
         </w:tc>
@@ -3780,7 +3984,7 @@
                 <w:b w:val="0"/>
                 <w:sz w:val="21"/>
               </w:rPr>
-              <w:t>第二阶段</w:t>
+              <w:t>Heckman两步法</w:t>
             </w:r>
           </w:p>
         </w:tc>
@@ -3803,7 +4007,7 @@
                 <w:b w:val="0"/>
                 <w:sz w:val="21"/>
               </w:rPr>
-              <w:t>Overpay</w:t>
+              <w:t>IV_lnSubsidy_l1</w:t>
             </w:r>
           </w:p>
         </w:tc>
@@ -3826,7 +4030,7 @@
                 <w:b w:val="0"/>
                 <w:sz w:val="21"/>
               </w:rPr>
-              <w:t>-0.0334</w:t>
+              <w:t>IMR p=0.0056</w:t>
             </w:r>
           </w:p>
         </w:tc>
@@ -3849,7 +4053,7 @@
                 <w:b w:val="0"/>
                 <w:sz w:val="21"/>
               </w:rPr>
-              <w:t>t = -1.5335</w:t>
+              <w:t>0.0093***; t=2.6543</w:t>
             </w:r>
           </w:p>
         </w:tc>
@@ -3872,7 +4076,7 @@
                 <w:b w:val="0"/>
                 <w:sz w:val="21"/>
               </w:rPr>
-              <w:t>46670</w:t>
+              <w:t>40679</w:t>
             </w:r>
           </w:p>
         </w:tc>
@@ -3887,7 +4091,7 @@
           <w:rFonts w:ascii="Times New Roman" w:hAnsi="Times New Roman" w:eastAsia="宋体"/>
           <w:sz w:val="18"/>
         </w:rPr>
-        <w:t>注：第一阶段报告工具变量系数；Partial R² 为 0.0019，说明工具变量具有统计相关性但解释力度有限。标准误为公司层面聚类稳健标准误。</w:t>
+        <w:t>注：前三行为公司固定效应 + 年份固定效应的 FE-2SLS 比较。基准工具变量为滞后一期同城同年其他企业平均补助；简单替代工具变量为滞后一期同行业同年其他企业平均补助；精炼双工具变量为“同行业同年排除本省平均补助”与“同省同行业同年排除本市平均补助”。Heckman 两步法仅用于 `lnSubsidy_pos_l1` 的正补助样本选择校正，第二阶段仍控制 Roa、Lever、Top1 以及公司和年份固定效应。</w:t>
       </w:r>
     </w:p>
     <w:p>
@@ -4149,7 +4353,7 @@
                 <w:b w:val="0"/>
                 <w:sz w:val="21"/>
               </w:rPr>
-              <w:t>0.0024</w:t>
+              <w:t>0.0017</w:t>
             </w:r>
           </w:p>
         </w:tc>
@@ -4169,7 +4373,7 @@
                 <w:b w:val="0"/>
                 <w:sz w:val="21"/>
               </w:rPr>
-              <w:t>0.0015</w:t>
+              <w:t>0.0013</w:t>
             </w:r>
           </w:p>
         </w:tc>
@@ -4231,7 +4435,7 @@
                 <w:b w:val="0"/>
                 <w:sz w:val="21"/>
               </w:rPr>
-              <w:t>0.0227***</w:t>
+              <w:t>0.0117*</w:t>
             </w:r>
           </w:p>
         </w:tc>
@@ -4251,7 +4455,7 @@
                 <w:b w:val="0"/>
                 <w:sz w:val="21"/>
               </w:rPr>
-              <w:t>0.0068</w:t>
+              <w:t>0.0063</w:t>
             </w:r>
           </w:p>
         </w:tc>
@@ -4395,7 +4599,7 @@
                 <w:b w:val="0"/>
                 <w:sz w:val="21"/>
               </w:rPr>
-              <w:t>0.000055</w:t>
+              <w:t>0.000020</w:t>
             </w:r>
           </w:p>
         </w:tc>
@@ -4435,7 +4639,7 @@
                 <w:b w:val="0"/>
                 <w:sz w:val="21"/>
               </w:rPr>
-              <w:t>[-0.000004, 0.000132]</w:t>
+              <w:t>[-0.000009, 0.000070]</w:t>
             </w:r>
           </w:p>
         </w:tc>
@@ -4477,7 +4681,7 @@
                 <w:b w:val="0"/>
                 <w:sz w:val="21"/>
               </w:rPr>
-              <w:t>0.1580</w:t>
+              <w:t>0.2994</w:t>
             </w:r>
           </w:p>
         </w:tc>
@@ -4565,7 +4769,7 @@
                 <w:b w:val="0"/>
                 <w:sz w:val="21"/>
               </w:rPr>
-              <w:t>7.40%</w:t>
+              <w:t>2.80%</w:t>
             </w:r>
           </w:p>
         </w:tc>
@@ -4934,7 +5138,7 @@
                 <w:b w:val="0"/>
                 <w:sz w:val="21"/>
               </w:rPr>
-              <w:t>0.0036***</w:t>
+              <w:t>0.0035***</w:t>
             </w:r>
           </w:p>
         </w:tc>
@@ -4974,7 +5178,7 @@
                 <w:b w:val="0"/>
                 <w:sz w:val="21"/>
               </w:rPr>
-              <w:t>-0.0003</w:t>
+              <w:t>-0.0002</w:t>
             </w:r>
           </w:p>
         </w:tc>
@@ -5035,7 +5239,7 @@
                 <w:b w:val="0"/>
                 <w:sz w:val="21"/>
               </w:rPr>
-              <w:t>(3.7716)</w:t>
+              <w:t>(3.7531)</w:t>
             </w:r>
           </w:p>
         </w:tc>
@@ -5055,7 +5259,7 @@
                 <w:b w:val="0"/>
                 <w:sz w:val="21"/>
               </w:rPr>
-              <w:t>(0.9511)</w:t>
+              <w:t>(0.9361)</w:t>
             </w:r>
           </w:p>
         </w:tc>
@@ -5075,7 +5279,7 @@
                 <w:b w:val="0"/>
                 <w:sz w:val="21"/>
               </w:rPr>
-              <w:t>(-0.2180)</w:t>
+              <w:t>(-0.2086)</w:t>
             </w:r>
           </w:p>
         </w:tc>
@@ -5095,7 +5299,7 @@
                 <w:b w:val="0"/>
                 <w:sz w:val="21"/>
               </w:rPr>
-              <w:t>(2.8145)</w:t>
+              <w:t>(2.8007)</w:t>
             </w:r>
           </w:p>
         </w:tc>
@@ -5443,7 +5647,7 @@
                 <w:b w:val="0"/>
                 <w:sz w:val="21"/>
               </w:rPr>
-              <w:t>49940</w:t>
+              <w:t>49920</w:t>
             </w:r>
           </w:p>
         </w:tc>
@@ -5463,7 +5667,7 @@
                 <w:b w:val="0"/>
                 <w:sz w:val="21"/>
               </w:rPr>
-              <w:t>26449</w:t>
+              <w:t>26437</w:t>
             </w:r>
           </w:p>
         </w:tc>
@@ -5483,7 +5687,7 @@
                 <w:b w:val="0"/>
                 <w:sz w:val="21"/>
               </w:rPr>
-              <w:t>32515</w:t>
+              <w:t>32488</w:t>
             </w:r>
           </w:p>
         </w:tc>
@@ -5503,7 +5707,7 @@
                 <w:b w:val="0"/>
                 <w:sz w:val="21"/>
               </w:rPr>
-              <w:t>43442</w:t>
+              <w:t>43417</w:t>
             </w:r>
           </w:p>
         </w:tc>
@@ -5574,7 +5778,7 @@
                 <w:b w:val="0"/>
                 <w:sz w:val="21"/>
               </w:rPr>
-              <w:t>0.0225</w:t>
+              <w:t>0.0222</w:t>
             </w:r>
           </w:p>
         </w:tc>
@@ -5597,7 +5801,7 @@
                 <w:b w:val="0"/>
                 <w:sz w:val="21"/>
               </w:rPr>
-              <w:t>0.0131</w:t>
+              <w:t>0.0130</w:t>
             </w:r>
           </w:p>
         </w:tc>
@@ -5620,7 +5824,7 @@
                 <w:b w:val="0"/>
                 <w:sz w:val="21"/>
               </w:rPr>
-              <w:t>0.0208</w:t>
+              <w:t>0.0205</w:t>
             </w:r>
           </w:p>
         </w:tc>
@@ -5849,7 +6053,7 @@
                 <w:b w:val="0"/>
                 <w:sz w:val="21"/>
               </w:rPr>
-              <w:t>-0.0000</w:t>
+              <w:t>0.0000</w:t>
             </w:r>
           </w:p>
         </w:tc>
@@ -5910,7 +6114,7 @@
                 <w:b w:val="0"/>
                 <w:sz w:val="21"/>
               </w:rPr>
-              <w:t>(-0.0123)</w:t>
+              <w:t>(0.0248)</w:t>
             </w:r>
           </w:p>
         </w:tc>
@@ -5930,7 +6134,7 @@
                 <w:b w:val="0"/>
                 <w:sz w:val="21"/>
               </w:rPr>
-              <w:t>(-0.1228)</w:t>
+              <w:t>(-0.1145)</w:t>
             </w:r>
           </w:p>
         </w:tc>
@@ -5972,7 +6176,7 @@
                 <w:b w:val="0"/>
                 <w:sz w:val="21"/>
               </w:rPr>
-              <w:t>-0.1762</w:t>
+              <w:t>-0.1703</w:t>
             </w:r>
           </w:p>
         </w:tc>
@@ -5992,7 +6196,7 @@
                 <w:b w:val="0"/>
                 <w:sz w:val="21"/>
               </w:rPr>
-              <w:t>-1.2419***</w:t>
+              <w:t>-1.2358***</w:t>
             </w:r>
           </w:p>
         </w:tc>
@@ -6033,7 +6237,7 @@
                 <w:b w:val="0"/>
                 <w:sz w:val="21"/>
               </w:rPr>
-              <w:t>(-1.3496)</w:t>
+              <w:t>(-1.3058)</w:t>
             </w:r>
           </w:p>
         </w:tc>
@@ -6053,7 +6257,7 @@
                 <w:b w:val="0"/>
                 <w:sz w:val="21"/>
               </w:rPr>
-              <w:t>(-14.9064)</w:t>
+              <w:t>(-14.9249)</w:t>
             </w:r>
           </w:p>
         </w:tc>
@@ -6095,7 +6299,7 @@
                 <w:b w:val="0"/>
                 <w:sz w:val="21"/>
               </w:rPr>
-              <w:t>-0.1769***</w:t>
+              <w:t>-0.1757***</w:t>
             </w:r>
           </w:p>
         </w:tc>
@@ -6115,7 +6319,7 @@
                 <w:b w:val="0"/>
                 <w:sz w:val="21"/>
               </w:rPr>
-              <w:t>-0.0767</w:t>
+              <w:t>-0.0821</w:t>
             </w:r>
           </w:p>
         </w:tc>
@@ -6156,7 +6360,7 @@
                 <w:b w:val="0"/>
                 <w:sz w:val="21"/>
               </w:rPr>
-              <w:t>(-2.7245)</w:t>
+              <w:t>(-2.7042)</w:t>
             </w:r>
           </w:p>
         </w:tc>
@@ -6176,7 +6380,7 @@
                 <w:b w:val="0"/>
                 <w:sz w:val="21"/>
               </w:rPr>
-              <w:t>(-1.3910)</w:t>
+              <w:t>(-1.4953)</w:t>
             </w:r>
           </w:p>
         </w:tc>
@@ -6238,7 +6442,7 @@
                 <w:b w:val="0"/>
                 <w:sz w:val="21"/>
               </w:rPr>
-              <w:t>-0.0007</w:t>
+              <w:t>-0.0008</w:t>
             </w:r>
           </w:p>
         </w:tc>
@@ -6279,7 +6483,7 @@
                 <w:b w:val="0"/>
                 <w:sz w:val="21"/>
               </w:rPr>
-              <w:t>(-1.9395)</w:t>
+              <w:t>(-1.9479)</w:t>
             </w:r>
           </w:p>
         </w:tc>
@@ -6299,7 +6503,7 @@
                 <w:b w:val="0"/>
                 <w:sz w:val="21"/>
               </w:rPr>
-              <w:t>(-0.6982)</w:t>
+              <w:t>(-0.7082)</w:t>
             </w:r>
           </w:p>
         </w:tc>
@@ -6465,7 +6669,7 @@
                 <w:b w:val="0"/>
                 <w:sz w:val="21"/>
               </w:rPr>
-              <w:t>20252</w:t>
+              <w:t>20233</w:t>
             </w:r>
           </w:p>
         </w:tc>
@@ -6485,7 +6689,7 @@
                 <w:b w:val="0"/>
                 <w:sz w:val="21"/>
               </w:rPr>
-              <w:t>25126</w:t>
+              <w:t>25099</w:t>
             </w:r>
           </w:p>
         </w:tc>
@@ -6556,7 +6760,7 @@
                 <w:b w:val="0"/>
                 <w:sz w:val="21"/>
               </w:rPr>
-              <w:t>0.0319</w:t>
+              <w:t>0.0317</w:t>
             </w:r>
           </w:p>
         </w:tc>
@@ -6785,7 +6989,7 @@
                 <w:b w:val="0"/>
                 <w:sz w:val="21"/>
               </w:rPr>
-              <w:t>-0.0005</w:t>
+              <w:t>-0.0006</w:t>
             </w:r>
           </w:p>
         </w:tc>
@@ -6846,7 +7050,7 @@
                 <w:b w:val="0"/>
                 <w:sz w:val="21"/>
               </w:rPr>
-              <w:t>(-0.3123)</w:t>
+              <w:t>(-0.3560)</w:t>
             </w:r>
           </w:p>
         </w:tc>
@@ -6866,7 +7070,7 @@
                 <w:b w:val="0"/>
                 <w:sz w:val="21"/>
               </w:rPr>
-              <w:t>(0.7803)</w:t>
+              <w:t>(0.7896)</w:t>
             </w:r>
           </w:p>
         </w:tc>
@@ -6908,7 +7112,7 @@
                 <w:b w:val="0"/>
                 <w:sz w:val="21"/>
               </w:rPr>
-              <w:t>-1.4192***</w:t>
+              <w:t>-1.4176***</w:t>
             </w:r>
           </w:p>
         </w:tc>
@@ -6928,7 +7132,7 @@
                 <w:b w:val="0"/>
                 <w:sz w:val="21"/>
               </w:rPr>
-              <w:t>-0.8220***</w:t>
+              <w:t>-0.8173***</w:t>
             </w:r>
           </w:p>
         </w:tc>
@@ -6969,7 +7173,7 @@
                 <w:b w:val="0"/>
                 <w:sz w:val="21"/>
               </w:rPr>
-              <w:t>(-11.0892)</w:t>
+              <w:t>(-11.0995)</w:t>
             </w:r>
           </w:p>
         </w:tc>
@@ -6989,7 +7193,7 @@
                 <w:b w:val="0"/>
                 <w:sz w:val="21"/>
               </w:rPr>
-              <w:t>(-10.4924)</w:t>
+              <w:t>(-10.4495)</w:t>
             </w:r>
           </w:p>
         </w:tc>
@@ -7031,7 +7235,7 @@
                 <w:b w:val="0"/>
                 <w:sz w:val="21"/>
               </w:rPr>
-              <w:t>-0.1303**</w:t>
+              <w:t>-0.1312**</w:t>
             </w:r>
           </w:p>
         </w:tc>
@@ -7051,7 +7255,7 @@
                 <w:b w:val="0"/>
                 <w:sz w:val="21"/>
               </w:rPr>
-              <w:t>-0.0664</w:t>
+              <w:t>-0.0712</w:t>
             </w:r>
           </w:p>
         </w:tc>
@@ -7092,7 +7296,7 @@
                 <w:b w:val="0"/>
                 <w:sz w:val="21"/>
               </w:rPr>
-              <w:t>(-2.0495)</w:t>
+              <w:t>(-2.0618)</w:t>
             </w:r>
           </w:p>
         </w:tc>
@@ -7112,7 +7316,7 @@
                 <w:b w:val="0"/>
                 <w:sz w:val="21"/>
               </w:rPr>
-              <w:t>(-1.4688)</w:t>
+              <w:t>(-1.5793)</w:t>
             </w:r>
           </w:p>
         </w:tc>
@@ -7215,7 +7419,7 @@
                 <w:b w:val="0"/>
                 <w:sz w:val="21"/>
               </w:rPr>
-              <w:t>(-3.1814)</w:t>
+              <w:t>(-3.1516)</w:t>
             </w:r>
           </w:p>
         </w:tc>
@@ -7235,7 +7439,7 @@
                 <w:b w:val="0"/>
                 <w:sz w:val="21"/>
               </w:rPr>
-              <w:t>(-3.0589)</w:t>
+              <w:t>(-3.0972)</w:t>
             </w:r>
           </w:p>
         </w:tc>
@@ -7401,7 +7605,7 @@
                 <w:b w:val="0"/>
                 <w:sz w:val="21"/>
               </w:rPr>
-              <w:t>8333</w:t>
+              <w:t>8339</w:t>
             </w:r>
           </w:p>
         </w:tc>
@@ -7421,7 +7625,7 @@
                 <w:b w:val="0"/>
                 <w:sz w:val="21"/>
               </w:rPr>
-              <w:t>41442</w:t>
+              <w:t>41416</w:t>
             </w:r>
           </w:p>
         </w:tc>
@@ -7469,7 +7673,7 @@
                 <w:b w:val="0"/>
                 <w:sz w:val="21"/>
               </w:rPr>
-              <w:t>0.0528</w:t>
+              <w:t>0.0525</w:t>
             </w:r>
           </w:p>
         </w:tc>
@@ -7492,7 +7696,7 @@
                 <w:b w:val="0"/>
                 <w:sz w:val="21"/>
               </w:rPr>
-              <w:t>0.0133</w:t>
+              <w:t>0.0132</w:t>
             </w:r>
           </w:p>
         </w:tc>
@@ -7521,7 +7725,7 @@
           <w:b/>
           <w:sz w:val="24"/>
         </w:rPr>
-        <w:t>表9  央企与地方国企主回归结果（模型2，央地可识别比例=74.50%）</w:t>
+        <w:t>表9  央企与地方国企主回归结果（模型2，央地可识别比例=74.53%）</w:t>
       </w:r>
     </w:p>
     <w:tbl>
@@ -7741,7 +7945,7 @@
                 <w:b w:val="0"/>
                 <w:sz w:val="21"/>
               </w:rPr>
-              <w:t>-0.0013</w:t>
+              <w:t>-0.0012</w:t>
             </w:r>
           </w:p>
         </w:tc>
@@ -7782,7 +7986,7 @@
                 <w:b w:val="0"/>
                 <w:sz w:val="21"/>
               </w:rPr>
-              <w:t>(-0.3234)</w:t>
+              <w:t>(-0.3282)</w:t>
             </w:r>
           </w:p>
         </w:tc>
@@ -7802,7 +8006,7 @@
                 <w:b w:val="0"/>
                 <w:sz w:val="21"/>
               </w:rPr>
-              <w:t>(-0.9097)</w:t>
+              <w:t>(-0.8789)</w:t>
             </w:r>
           </w:p>
         </w:tc>
@@ -7844,7 +8048,7 @@
                 <w:b w:val="0"/>
                 <w:sz w:val="21"/>
               </w:rPr>
-              <w:t>-0.1738</w:t>
+              <w:t>-0.1620</w:t>
             </w:r>
           </w:p>
         </w:tc>
@@ -7864,7 +8068,7 @@
                 <w:b w:val="0"/>
                 <w:sz w:val="21"/>
               </w:rPr>
-              <w:t>-0.1676</w:t>
+              <w:t>-0.1534</w:t>
             </w:r>
           </w:p>
         </w:tc>
@@ -7905,7 +8109,7 @@
                 <w:b w:val="0"/>
                 <w:sz w:val="21"/>
               </w:rPr>
-              <w:t>(-0.6705)</w:t>
+              <w:t>(-0.6292)</w:t>
             </w:r>
           </w:p>
         </w:tc>
@@ -7925,7 +8129,7 @@
                 <w:b w:val="0"/>
                 <w:sz w:val="21"/>
               </w:rPr>
-              <w:t>(-1.0051)</w:t>
+              <w:t>(-0.9197)</w:t>
             </w:r>
           </w:p>
         </w:tc>
@@ -7967,7 +8171,7 @@
                 <w:b w:val="0"/>
                 <w:sz w:val="21"/>
               </w:rPr>
-              <w:t>-0.0141</w:t>
+              <w:t>0.0020</w:t>
             </w:r>
           </w:p>
         </w:tc>
@@ -7987,7 +8191,7 @@
                 <w:b w:val="0"/>
                 <w:sz w:val="21"/>
               </w:rPr>
-              <w:t>-0.1513**</w:t>
+              <w:t>-0.1519**</w:t>
             </w:r>
           </w:p>
         </w:tc>
@@ -8028,7 +8232,7 @@
                 <w:b w:val="0"/>
                 <w:sz w:val="21"/>
               </w:rPr>
-              <w:t>(-0.0929)</w:t>
+              <w:t>(0.0130)</w:t>
             </w:r>
           </w:p>
         </w:tc>
@@ -8048,7 +8252,7 @@
                 <w:b w:val="0"/>
                 <w:sz w:val="21"/>
               </w:rPr>
-              <w:t>(-1.9918)</w:t>
+              <w:t>(-2.0007)</w:t>
             </w:r>
           </w:p>
         </w:tc>
@@ -8090,7 +8294,7 @@
                 <w:b w:val="0"/>
                 <w:sz w:val="21"/>
               </w:rPr>
-              <w:t>-0.0014</w:t>
+              <w:t>-0.0013</w:t>
             </w:r>
           </w:p>
         </w:tc>
@@ -8110,7 +8314,7 @@
                 <w:b w:val="0"/>
                 <w:sz w:val="21"/>
               </w:rPr>
-              <w:t>-0.0033**</w:t>
+              <w:t>-0.0034**</w:t>
             </w:r>
           </w:p>
         </w:tc>
@@ -8151,7 +8355,7 @@
                 <w:b w:val="0"/>
                 <w:sz w:val="21"/>
               </w:rPr>
-              <w:t>(-0.7686)</w:t>
+              <w:t>(-0.7117)</w:t>
             </w:r>
           </w:p>
         </w:tc>
@@ -8171,7 +8375,7 @@
                 <w:b w:val="0"/>
                 <w:sz w:val="21"/>
               </w:rPr>
-              <w:t>(-2.1400)</w:t>
+              <w:t>(-2.1888)</w:t>
             </w:r>
           </w:p>
         </w:tc>
@@ -8357,7 +8561,7 @@
                 <w:b w:val="0"/>
                 <w:sz w:val="21"/>
               </w:rPr>
-              <w:t>10503</w:t>
+              <w:t>10494</w:t>
             </w:r>
           </w:p>
         </w:tc>
@@ -8405,7 +8609,7 @@
                 <w:b w:val="0"/>
                 <w:sz w:val="21"/>
               </w:rPr>
-              <w:t>0.0012</w:t>
+              <w:t>0.0011</w:t>
             </w:r>
           </w:p>
         </w:tc>
@@ -8428,7 +8632,7 @@
                 <w:b w:val="0"/>
                 <w:sz w:val="21"/>
               </w:rPr>
-              <w:t>0.0059</w:t>
+              <w:t>0.0061</w:t>
             </w:r>
           </w:p>
         </w:tc>

</xml_diff>

<commit_message>
Add thesis_final_humanized_v2.pdf to the final bundle
</commit_message>
<xml_diff>
--- a/results/回归结果表.docx
+++ b/results/回归结果表.docx
@@ -3502,7 +3502,7 @@
           <w:b/>
           <w:sz w:val="24"/>
         </w:rPr>
-        <w:t>表4  工具变量与 Heckman 两阶段结果</w:t>
+        <w:t>表4  内生性识别与 Heckman 两阶段结果</w:t>
       </w:r>
     </w:p>
     <w:tbl>
@@ -3968,6 +3968,210 @@
         <w:tc>
           <w:tcPr>
             <w:tcW w:type="dxa" w:w="1728"/>
+          </w:tcPr>
+          <w:p>
+            <w:pPr>
+              <w:spacing w:before="20" w:after="20" w:line="280" w:lineRule="exact"/>
+              <w:jc w:val="center"/>
+            </w:pPr>
+            <w:r/>
+            <w:r>
+              <w:rPr>
+                <w:rFonts w:ascii="Times New Roman" w:hAnsi="Times New Roman" w:eastAsia="宋体"/>
+                <w:b w:val="0"/>
+                <w:sz w:val="21"/>
+              </w:rPr>
+              <w:t>增强shift-share单工具</w:t>
+            </w:r>
+          </w:p>
+        </w:tc>
+        <w:tc>
+          <w:tcPr>
+            <w:tcW w:type="dxa" w:w="1728"/>
+          </w:tcPr>
+          <w:p>
+            <w:pPr>
+              <w:spacing w:before="20" w:after="20" w:line="280" w:lineRule="exact"/>
+              <w:jc w:val="left"/>
+            </w:pPr>
+            <w:r/>
+            <w:r>
+              <w:rPr>
+                <w:rFonts w:ascii="Times New Roman" w:hAnsi="Times New Roman" w:eastAsia="宋体"/>
+                <w:b w:val="0"/>
+                <w:sz w:val="21"/>
+              </w:rPr>
+              <w:t>企业早期补贴暴露度 × 全国（排除本省）行业补贴增量</w:t>
+            </w:r>
+          </w:p>
+        </w:tc>
+        <w:tc>
+          <w:tcPr>
+            <w:tcW w:type="dxa" w:w="1728"/>
+          </w:tcPr>
+          <w:p>
+            <w:pPr>
+              <w:spacing w:before="20" w:after="20" w:line="280" w:lineRule="exact"/>
+              <w:jc w:val="center"/>
+            </w:pPr>
+            <w:r/>
+            <w:r>
+              <w:rPr>
+                <w:rFonts w:ascii="Times New Roman" w:hAnsi="Times New Roman" w:eastAsia="宋体"/>
+                <w:b w:val="0"/>
+                <w:sz w:val="21"/>
+              </w:rPr>
+              <w:t>F=0.31</w:t>
+            </w:r>
+          </w:p>
+        </w:tc>
+        <w:tc>
+          <w:tcPr>
+            <w:tcW w:type="dxa" w:w="1728"/>
+          </w:tcPr>
+          <w:p>
+            <w:pPr>
+              <w:spacing w:before="20" w:after="20" w:line="280" w:lineRule="exact"/>
+              <w:jc w:val="center"/>
+            </w:pPr>
+            <w:r/>
+            <w:r>
+              <w:rPr>
+                <w:rFonts w:ascii="Times New Roman" w:hAnsi="Times New Roman" w:eastAsia="宋体"/>
+                <w:b w:val="0"/>
+                <w:sz w:val="21"/>
+              </w:rPr>
+              <w:t>0.5203; t=0.5512</w:t>
+            </w:r>
+          </w:p>
+        </w:tc>
+        <w:tc>
+          <w:tcPr>
+            <w:tcW w:type="dxa" w:w="1728"/>
+          </w:tcPr>
+          <w:p>
+            <w:pPr>
+              <w:spacing w:before="20" w:after="20" w:line="280" w:lineRule="exact"/>
+              <w:jc w:val="center"/>
+            </w:pPr>
+            <w:r/>
+            <w:r>
+              <w:rPr>
+                <w:rFonts w:ascii="Times New Roman" w:hAnsi="Times New Roman" w:eastAsia="宋体"/>
+                <w:b w:val="0"/>
+                <w:sz w:val="21"/>
+              </w:rPr>
+              <w:t>48897</w:t>
+            </w:r>
+          </w:p>
+        </w:tc>
+      </w:tr>
+      <w:tr>
+        <w:tc>
+          <w:tcPr>
+            <w:tcW w:type="dxa" w:w="1728"/>
+          </w:tcPr>
+          <w:p>
+            <w:pPr>
+              <w:spacing w:before="20" w:after="20" w:line="280" w:lineRule="exact"/>
+              <w:jc w:val="center"/>
+            </w:pPr>
+            <w:r/>
+            <w:r>
+              <w:rPr>
+                <w:rFonts w:ascii="Times New Roman" w:hAnsi="Times New Roman" w:eastAsia="宋体"/>
+                <w:b w:val="0"/>
+                <w:sz w:val="21"/>
+              </w:rPr>
+              <w:t>增强shift-share双工具</w:t>
+            </w:r>
+          </w:p>
+        </w:tc>
+        <w:tc>
+          <w:tcPr>
+            <w:tcW w:type="dxa" w:w="1728"/>
+          </w:tcPr>
+          <w:p>
+            <w:pPr>
+              <w:spacing w:before="20" w:after="20" w:line="280" w:lineRule="exact"/>
+              <w:jc w:val="left"/>
+            </w:pPr>
+            <w:r/>
+            <w:r>
+              <w:rPr>
+                <w:rFonts w:ascii="Times New Roman" w:hAnsi="Times New Roman" w:eastAsia="宋体"/>
+                <w:b w:val="0"/>
+                <w:sz w:val="21"/>
+              </w:rPr>
+              <w:t>省—行业正补助暴露度 × 全国（排除本省）行业补贴增量 + 企业早期补贴暴露度 × 全国（排除本省）行业补贴增量</w:t>
+            </w:r>
+          </w:p>
+        </w:tc>
+        <w:tc>
+          <w:tcPr>
+            <w:tcW w:type="dxa" w:w="1728"/>
+          </w:tcPr>
+          <w:p>
+            <w:pPr>
+              <w:spacing w:before="20" w:after="20" w:line="280" w:lineRule="exact"/>
+              <w:jc w:val="center"/>
+            </w:pPr>
+            <w:r/>
+            <w:r>
+              <w:rPr>
+                <w:rFonts w:ascii="Times New Roman" w:hAnsi="Times New Roman" w:eastAsia="宋体"/>
+                <w:b w:val="0"/>
+                <w:sz w:val="21"/>
+              </w:rPr>
+              <w:t>F=0.73; OverID p=0.759</w:t>
+            </w:r>
+          </w:p>
+        </w:tc>
+        <w:tc>
+          <w:tcPr>
+            <w:tcW w:type="dxa" w:w="1728"/>
+          </w:tcPr>
+          <w:p>
+            <w:pPr>
+              <w:spacing w:before="20" w:after="20" w:line="280" w:lineRule="exact"/>
+              <w:jc w:val="center"/>
+            </w:pPr>
+            <w:r/>
+            <w:r>
+              <w:rPr>
+                <w:rFonts w:ascii="Times New Roman" w:hAnsi="Times New Roman" w:eastAsia="宋体"/>
+                <w:b w:val="0"/>
+                <w:sz w:val="21"/>
+              </w:rPr>
+              <w:t>0.3267; t=0.8327</w:t>
+            </w:r>
+          </w:p>
+        </w:tc>
+        <w:tc>
+          <w:tcPr>
+            <w:tcW w:type="dxa" w:w="1728"/>
+          </w:tcPr>
+          <w:p>
+            <w:pPr>
+              <w:spacing w:before="20" w:after="20" w:line="280" w:lineRule="exact"/>
+              <w:jc w:val="center"/>
+            </w:pPr>
+            <w:r/>
+            <w:r>
+              <w:rPr>
+                <w:rFonts w:ascii="Times New Roman" w:hAnsi="Times New Roman" w:eastAsia="宋体"/>
+                <w:b w:val="0"/>
+                <w:sz w:val="21"/>
+              </w:rPr>
+              <w:t>46537</w:t>
+            </w:r>
+          </w:p>
+        </w:tc>
+      </w:tr>
+      <w:tr>
+        <w:tc>
+          <w:tcPr>
+            <w:tcW w:type="dxa" w:w="1728"/>
             <w:tcBorders>
               <w:bottom w:val="single" w:sz="12" w:space="0" w:color="000000"/>
             </w:tcBorders>
@@ -4091,7 +4295,7 @@
           <w:rFonts w:ascii="Times New Roman" w:hAnsi="Times New Roman" w:eastAsia="宋体"/>
           <w:sz w:val="18"/>
         </w:rPr>
-        <w:t>注：前三行为公司固定效应 + 年份固定效应的 FE-2SLS 比较。基准工具变量为滞后一期同城同年其他企业平均补助；简单替代工具变量为滞后一期同行业同年其他企业平均补助；精炼双工具变量为“同行业同年排除本省平均补助”与“同省同行业同年排除本市平均补助”。Heckman 两步法仅用于 `lnSubsidy_pos_l1` 的正补助样本选择校正，第二阶段仍控制 Roa、Lever、Top1 以及公司和年份固定效应。</w:t>
+        <w:t>注：前三行为公司固定效应 + 年份固定效应的 FE-2SLS 比较；其后两行为公司固定效应 + 行业×年份固定效应下的 shift-share Bartik 识别。增强 shift-share 工具变量以预定暴露度（企业早期补贴暴露度或省—行业早期正补助暴露度）与全国（排除本省）行业补贴年度增量的交互项构造。Heckman 两步法仅用于 `lnSubsidy_pos_l1` 的正补助样本选择校正，第二阶段仍控制 Roa、Lever、Top1 以及公司和年份固定效应。</w:t>
       </w:r>
     </w:p>
     <w:p>

</xml_diff>